<commit_message>
Add PowerBI/PowerAutomate materials, Azure AI invoicing docs, and dbt resources
Co-Authored-By: Claude Sonnet 4.6 <noreply@anthropic.com>
</commit_message>
<xml_diff>
--- a/Dax/Top10_DAX_PowerBI_Interview (Repaired).docx
+++ b/Dax/Top10_DAX_PowerBI_Interview (Repaired).docx
@@ -2270,8 +2270,9 @@
                 <w:sz w:val="16"/>
                 <w:szCs w:val="16"/>
               </w:rPr>
-              <w:t xml:space="preserve">up to </w:t>
-            </w:r>
+              <w:t xml:space="preserve">up </w:t>
+            </w:r>
+            <w:proofErr w:type="gramStart"/>
             <w:r>
               <w:rPr>
                 <w:rFonts w:ascii="Courier New" w:eastAsia="Courier New" w:hAnsi="Courier New" w:cs="Courier New"/>
@@ -2283,45 +2284,34 @@
                 <w:sz w:val="16"/>
                 <w:szCs w:val="16"/>
               </w:rPr>
-              <w:t xml:space="preserve"> 12 month back data</w:t>
-            </w:r>
-          </w:p>
-        </w:tc>
-      </w:tr>
-      <w:tr>
-        <w:tc>
-          <w:tcPr>
-            <w:tcW w:w="9026" w:type="dxa"/>
-            <w:tcBorders>
-              <w:top w:val="none" w:sz="0" w:space="0" w:color="FFFFFF"/>
-              <w:left w:val="none" w:sz="0" w:space="0" w:color="FFFFFF"/>
-              <w:bottom w:val="none" w:sz="0" w:space="0" w:color="FFFFFF"/>
-              <w:right w:val="none" w:sz="0" w:space="0" w:color="FFFFFF"/>
-            </w:tcBorders>
-            <w:shd w:val="clear" w:color="auto" w:fill="F2F2F2"/>
-            <w:tcMar>
-              <w:top w:w="0" w:type="dxa"/>
-              <w:left w:w="200" w:type="dxa"/>
-              <w:bottom w:w="0" w:type="dxa"/>
-              <w:right w:w="200" w:type="dxa"/>
-            </w:tcMar>
-          </w:tcPr>
-          <w:p>
-            <w:pPr>
-              <w:ind w:left="280"/>
-              <w:rPr>
+              <w:t xml:space="preserve">to </w:t>
+            </w:r>
+            <w:r>
+              <w:rPr>
+                <w:rFonts w:ascii="Courier New" w:eastAsia="Courier New" w:hAnsi="Courier New" w:cs="Courier New"/>
+                <w:b/>
+                <w:bCs/>
+                <w:i/>
+                <w:iCs/>
+                <w:color w:val="3A7C22" w:themeColor="accent6" w:themeShade="BF"/>
                 <w:sz w:val="16"/>
                 <w:szCs w:val="16"/>
               </w:rPr>
-            </w:pPr>
-            <w:r>
-              <w:rPr>
-                <w:rFonts w:ascii="Courier New" w:eastAsia="Courier New" w:hAnsi="Courier New" w:cs="Courier New"/>
-                <w:color w:val="1A1A2E"/>
+              <w:t xml:space="preserve"> 12</w:t>
+            </w:r>
+            <w:proofErr w:type="gramEnd"/>
+            <w:r>
+              <w:rPr>
+                <w:rFonts w:ascii="Courier New" w:eastAsia="Courier New" w:hAnsi="Courier New" w:cs="Courier New"/>
+                <w:b/>
+                <w:bCs/>
+                <w:i/>
+                <w:iCs/>
+                <w:color w:val="3A7C22" w:themeColor="accent6" w:themeShade="BF"/>
                 <w:sz w:val="16"/>
                 <w:szCs w:val="16"/>
               </w:rPr>
-              <w:t>Sales Rolling 12M =</w:t>
+              <w:t xml:space="preserve"> month back data</w:t>
             </w:r>
           </w:p>
         </w:tc>
@@ -2359,7 +2349,7 @@
                 <w:sz w:val="16"/>
                 <w:szCs w:val="16"/>
               </w:rPr>
-              <w:t>CALCULATE(</w:t>
+              <w:t>Sales Rolling 12M =</w:t>
             </w:r>
           </w:p>
         </w:tc>
@@ -2397,7 +2387,7 @@
                 <w:sz w:val="16"/>
                 <w:szCs w:val="16"/>
               </w:rPr>
-              <w:t xml:space="preserve">    SUM(Sales[Amount]),</w:t>
+              <w:t>CALCULATE(</w:t>
             </w:r>
           </w:p>
         </w:tc>
@@ -2435,35 +2425,33 @@
                 <w:sz w:val="16"/>
                 <w:szCs w:val="16"/>
               </w:rPr>
-              <w:t xml:space="preserve">    DATESINPERIOD('Date'[Date], LASTDATE('Date'[Date]), -12, MONTH)</w:t>
-            </w:r>
-          </w:p>
-        </w:tc>
-      </w:tr>
-      <w:tr>
-        <w:tc>
-          <w:tcPr>
-            <w:tcW w:w="9026" w:type="dxa"/>
-            <w:tcBorders>
-              <w:top w:val="none" w:sz="0" w:space="0" w:color="FFFFFF"/>
-              <w:left w:val="none" w:sz="0" w:space="0" w:color="FFFFFF"/>
-              <w:bottom w:val="none" w:sz="0" w:space="0" w:color="FFFFFF"/>
-              <w:right w:val="none" w:sz="0" w:space="0" w:color="FFFFFF"/>
-            </w:tcBorders>
-            <w:shd w:val="clear" w:color="auto" w:fill="F2F2F2"/>
-            <w:tcMar>
-              <w:top w:w="0" w:type="dxa"/>
-              <w:left w:w="200" w:type="dxa"/>
-              <w:bottom w:w="0" w:type="dxa"/>
-              <w:right w:w="200" w:type="dxa"/>
-            </w:tcMar>
-          </w:tcPr>
-          <w:p>
-            <w:pPr>
-              <w:ind w:left="280"/>
-              <w:rPr>
-                <w:rFonts w:ascii="Courier New" w:eastAsia="Courier New" w:hAnsi="Courier New" w:cs="Courier New"/>
-                <w:color w:val="1A1A2E"/>
+              <w:t xml:space="preserve">    SUM(Sales[Amount]),</w:t>
+            </w:r>
+          </w:p>
+        </w:tc>
+      </w:tr>
+      <w:tr>
+        <w:tc>
+          <w:tcPr>
+            <w:tcW w:w="9026" w:type="dxa"/>
+            <w:tcBorders>
+              <w:top w:val="none" w:sz="0" w:space="0" w:color="FFFFFF"/>
+              <w:left w:val="none" w:sz="0" w:space="0" w:color="FFFFFF"/>
+              <w:bottom w:val="none" w:sz="0" w:space="0" w:color="FFFFFF"/>
+              <w:right w:val="none" w:sz="0" w:space="0" w:color="FFFFFF"/>
+            </w:tcBorders>
+            <w:shd w:val="clear" w:color="auto" w:fill="F2F2F2"/>
+            <w:tcMar>
+              <w:top w:w="0" w:type="dxa"/>
+              <w:left w:w="200" w:type="dxa"/>
+              <w:bottom w:w="0" w:type="dxa"/>
+              <w:right w:w="200" w:type="dxa"/>
+            </w:tcMar>
+          </w:tcPr>
+          <w:p>
+            <w:pPr>
+              <w:ind w:left="280"/>
+              <w:rPr>
                 <w:sz w:val="16"/>
                 <w:szCs w:val="16"/>
               </w:rPr>
@@ -2475,26 +2463,48 @@
                 <w:sz w:val="16"/>
                 <w:szCs w:val="16"/>
               </w:rPr>
-              <w:t>)</w:t>
-            </w:r>
-          </w:p>
-          <w:p>
-            <w:pPr>
-              <w:ind w:left="280"/>
-              <w:rPr>
+              <w:t xml:space="preserve">    DATESINPERIOD('Date'[Date], LASTDATE('Date'[Date]), -12, MONTH)</w:t>
+            </w:r>
+          </w:p>
+        </w:tc>
+      </w:tr>
+      <w:tr>
+        <w:tc>
+          <w:tcPr>
+            <w:tcW w:w="9026" w:type="dxa"/>
+            <w:tcBorders>
+              <w:top w:val="none" w:sz="0" w:space="0" w:color="FFFFFF"/>
+              <w:left w:val="none" w:sz="0" w:space="0" w:color="FFFFFF"/>
+              <w:bottom w:val="none" w:sz="0" w:space="0" w:color="FFFFFF"/>
+              <w:right w:val="none" w:sz="0" w:space="0" w:color="FFFFFF"/>
+            </w:tcBorders>
+            <w:shd w:val="clear" w:color="auto" w:fill="F2F2F2"/>
+            <w:tcMar>
+              <w:top w:w="0" w:type="dxa"/>
+              <w:left w:w="200" w:type="dxa"/>
+              <w:bottom w:w="0" w:type="dxa"/>
+              <w:right w:w="200" w:type="dxa"/>
+            </w:tcMar>
+          </w:tcPr>
+          <w:p>
+            <w:pPr>
+              <w:ind w:left="280"/>
+              <w:rPr>
+                <w:rFonts w:ascii="Courier New" w:eastAsia="Courier New" w:hAnsi="Courier New" w:cs="Courier New"/>
+                <w:color w:val="1A1A2E"/>
                 <w:sz w:val="16"/>
                 <w:szCs w:val="16"/>
               </w:rPr>
             </w:pPr>
-          </w:p>
-          <w:p>
-            <w:pPr>
-              <w:ind w:left="280"/>
-              <w:rPr>
+            <w:r>
+              <w:rPr>
+                <w:rFonts w:ascii="Courier New" w:eastAsia="Courier New" w:hAnsi="Courier New" w:cs="Courier New"/>
+                <w:color w:val="1A1A2E"/>
                 <w:sz w:val="16"/>
                 <w:szCs w:val="16"/>
               </w:rPr>
-            </w:pPr>
+              <w:t>)</w:t>
+            </w:r>
           </w:p>
           <w:p>
             <w:pPr>
@@ -2504,37 +2514,119 @@
                 <w:szCs w:val="16"/>
               </w:rPr>
             </w:pPr>
-            <w:r>
-              <w:rPr>
-                <w:rFonts w:ascii="Courier New" w:eastAsia="Courier New" w:hAnsi="Courier New" w:cs="Courier New"/>
-                <w:color w:val="1A1A2E"/>
+          </w:p>
+          <w:p>
+            <w:pPr>
+              <w:ind w:left="280"/>
+              <w:rPr>
                 <w:sz w:val="16"/>
                 <w:szCs w:val="16"/>
               </w:rPr>
-              <w:t>// Calculation group</w:t>
-            </w:r>
-            <w:r>
+            </w:pPr>
+          </w:p>
+          <w:p>
+            <w:pPr>
+              <w:ind w:left="280"/>
               <w:rPr>
                 <w:sz w:val="16"/>
                 <w:szCs w:val="16"/>
               </w:rPr>
-              <w:t xml:space="preserve"> </w:t>
-            </w:r>
-          </w:p>
-          <w:p>
-            <w:pPr>
-              <w:ind w:left="280"/>
-              <w:rPr>
+            </w:pPr>
+            <w:r>
+              <w:rPr>
+                <w:rFonts w:ascii="Courier New" w:eastAsia="Courier New" w:hAnsi="Courier New" w:cs="Courier New"/>
+                <w:color w:val="1A1A2E"/>
                 <w:sz w:val="16"/>
                 <w:szCs w:val="16"/>
               </w:rPr>
-            </w:pPr>
+              <w:t>// Calculation group</w:t>
+            </w:r>
             <w:r>
               <w:rPr>
                 <w:sz w:val="16"/>
                 <w:szCs w:val="16"/>
               </w:rPr>
-              <w:t>Time intelligence function acting as a template to automatically create time intelligence Measures like YTD, MTD,YOY  for any aggregated value (total amount , qty , revenue , margin...)</w:t>
+              <w:t xml:space="preserve"> </w:t>
+            </w:r>
+          </w:p>
+          <w:p>
+            <w:pPr>
+              <w:ind w:left="280"/>
+              <w:rPr>
+                <w:sz w:val="16"/>
+                <w:szCs w:val="16"/>
+              </w:rPr>
+            </w:pPr>
+            <w:r>
+              <w:rPr>
+                <w:sz w:val="16"/>
+                <w:szCs w:val="16"/>
+              </w:rPr>
+              <w:t xml:space="preserve">Time intelligence function acting as a template to automatically create time intelligence Measures like YTD, </w:t>
+            </w:r>
+            <w:proofErr w:type="gramStart"/>
+            <w:r>
+              <w:rPr>
+                <w:sz w:val="16"/>
+                <w:szCs w:val="16"/>
+              </w:rPr>
+              <w:t>MTD,YOY</w:t>
+            </w:r>
+            <w:proofErr w:type="gramEnd"/>
+            <w:r>
+              <w:rPr>
+                <w:sz w:val="16"/>
+                <w:szCs w:val="16"/>
+              </w:rPr>
+              <w:t xml:space="preserve">  for any aggregated value (total </w:t>
+            </w:r>
+            <w:proofErr w:type="gramStart"/>
+            <w:r>
+              <w:rPr>
+                <w:sz w:val="16"/>
+                <w:szCs w:val="16"/>
+              </w:rPr>
+              <w:t>amount ,</w:t>
+            </w:r>
+            <w:proofErr w:type="gramEnd"/>
+            <w:r>
+              <w:rPr>
+                <w:sz w:val="16"/>
+                <w:szCs w:val="16"/>
+              </w:rPr>
+              <w:t xml:space="preserve"> </w:t>
+            </w:r>
+            <w:proofErr w:type="gramStart"/>
+            <w:r>
+              <w:rPr>
+                <w:sz w:val="16"/>
+                <w:szCs w:val="16"/>
+              </w:rPr>
+              <w:t>qty ,</w:t>
+            </w:r>
+            <w:proofErr w:type="gramEnd"/>
+            <w:r>
+              <w:rPr>
+                <w:sz w:val="16"/>
+                <w:szCs w:val="16"/>
+              </w:rPr>
+              <w:t xml:space="preserve"> </w:t>
+            </w:r>
+            <w:proofErr w:type="gramStart"/>
+            <w:r>
+              <w:rPr>
+                <w:sz w:val="16"/>
+                <w:szCs w:val="16"/>
+              </w:rPr>
+              <w:t>revenue ,</w:t>
+            </w:r>
+            <w:proofErr w:type="gramEnd"/>
+            <w:r>
+              <w:rPr>
+                <w:sz w:val="16"/>
+                <w:szCs w:val="16"/>
+              </w:rPr>
+              <w:t xml:space="preserve"> margin...)</w:t>
             </w:r>
           </w:p>
           <w:p>
@@ -3854,7 +3946,31 @@
                 <w:sz w:val="16"/>
                 <w:szCs w:val="16"/>
               </w:rPr>
-              <w:t>next rank after 2 product with a rank of 2 will 4)</w:t>
+              <w:t xml:space="preserve">next rank after 2 </w:t>
+            </w:r>
+            <w:proofErr w:type="gramStart"/>
+            <w:r>
+              <w:rPr>
+                <w:rFonts w:ascii="Courier New" w:eastAsia="Courier New" w:hAnsi="Courier New" w:cs="Courier New"/>
+                <w:i/>
+                <w:iCs/>
+                <w:color w:val="3A7C22" w:themeColor="accent6" w:themeShade="BF"/>
+                <w:sz w:val="16"/>
+                <w:szCs w:val="16"/>
+              </w:rPr>
+              <w:t>product</w:t>
+            </w:r>
+            <w:proofErr w:type="gramEnd"/>
+            <w:r>
+              <w:rPr>
+                <w:rFonts w:ascii="Courier New" w:eastAsia="Courier New" w:hAnsi="Courier New" w:cs="Courier New"/>
+                <w:i/>
+                <w:iCs/>
+                <w:color w:val="3A7C22" w:themeColor="accent6" w:themeShade="BF"/>
+                <w:sz w:val="16"/>
+                <w:szCs w:val="16"/>
+              </w:rPr>
+              <w:t xml:space="preserve"> with a rank of 2 will 4)</w:t>
             </w:r>
           </w:p>
         </w:tc>
@@ -4660,6 +4776,12 @@
           <w:p>
             <w:pPr>
               <w:ind w:left="280"/>
+              <w:rPr>
+                <w:rFonts w:ascii="Courier New" w:eastAsia="Courier New" w:hAnsi="Courier New" w:cs="Courier New"/>
+                <w:color w:val="1A1A2E"/>
+                <w:sz w:val="18"/>
+                <w:szCs w:val="18"/>
+              </w:rPr>
             </w:pPr>
             <w:r>
               <w:rPr>
@@ -4671,6 +4793,41 @@
               <w:t>)</w:t>
             </w:r>
           </w:p>
+          <w:p>
+            <w:pPr>
+              <w:ind w:left="280"/>
+              <w:rPr>
+                <w:color w:val="1A1A2E"/>
+                <w:sz w:val="18"/>
+                <w:szCs w:val="18"/>
+              </w:rPr>
+            </w:pPr>
+          </w:p>
+          <w:p>
+            <w:pPr>
+              <w:ind w:left="280"/>
+              <w:rPr>
+                <w:color w:val="1A1A2E"/>
+                <w:sz w:val="18"/>
+                <w:szCs w:val="18"/>
+              </w:rPr>
+            </w:pPr>
+          </w:p>
+          <w:p>
+            <w:pPr>
+              <w:ind w:left="280"/>
+              <w:rPr>
+                <w:color w:val="1A1A2E"/>
+                <w:sz w:val="18"/>
+                <w:szCs w:val="18"/>
+              </w:rPr>
+            </w:pPr>
+          </w:p>
+          <w:p>
+            <w:pPr>
+              <w:ind w:left="280"/>
+            </w:pPr>
+          </w:p>
         </w:tc>
       </w:tr>
       <w:tr>
@@ -4863,7 +5020,6 @@
                 <w:sz w:val="18"/>
                 <w:szCs w:val="18"/>
               </w:rPr>
-              <w:lastRenderedPageBreak/>
               <w:t xml:space="preserve">    CALCULATE(SUM(Sales[Amount]), ALLSELECTED(Products)),</w:t>
             </w:r>
           </w:p>
@@ -6527,7 +6683,6 @@
                 <w:sz w:val="18"/>
                 <w:szCs w:val="18"/>
               </w:rPr>
-              <w:lastRenderedPageBreak/>
               <w:t>// Use in a calculated column</w:t>
             </w:r>
           </w:p>
@@ -8392,6 +8547,7 @@
                 <w:sz w:val="20"/>
                 <w:szCs w:val="20"/>
               </w:rPr>
+              <w:lastRenderedPageBreak/>
               <w:t xml:space="preserve">Interview tip: </w:t>
             </w:r>
             <w:r>
@@ -10065,6 +10221,7 @@
                 <w:sz w:val="18"/>
                 <w:szCs w:val="18"/>
               </w:rPr>
+              <w:lastRenderedPageBreak/>
               <w:t>// Force bidirectional filter for a specific measure</w:t>
             </w:r>
           </w:p>
@@ -12496,6 +12653,7 @@
                 <w:sz w:val="18"/>
                 <w:szCs w:val="18"/>
               </w:rPr>
+              <w:lastRenderedPageBreak/>
               <w:t>VAR N = SELECTEDVALUE(</w:t>
             </w:r>
             <w:proofErr w:type="spellStart"/>

</xml_diff>

<commit_message>
Add new docs, update README, remove Office temp files
- Add Power Platform guides (weeks 1-4), CV files, DAX/SSIS updates
- Add .gitignore to prevent ~$ lock files and *.tmp from being tracked
- Remove all previously tracked Office lock/temp files

Co-Authored-By: Claude Sonnet 4.6 <noreply@anthropic.com>
</commit_message>
<xml_diff>
--- a/Dax/Top10_DAX_PowerBI_Interview (Repaired).docx
+++ b/Dax/Top10_DAX_PowerBI_Interview (Repaired).docx
@@ -1124,6 +1124,9 @@
           <w:p>
             <w:pPr>
               <w:ind w:left="280"/>
+              <w:rPr>
+                <w:lang w:val="en-GB"/>
+              </w:rPr>
             </w:pPr>
             <w:r>
               <w:rPr>
@@ -2231,23 +2234,6 @@
             <w:pPr>
               <w:ind w:left="280"/>
               <w:rPr>
-                <w:sz w:val="16"/>
-                <w:szCs w:val="16"/>
-              </w:rPr>
-            </w:pPr>
-            <w:r>
-              <w:rPr>
-                <w:rFonts w:ascii="Courier New" w:eastAsia="Courier New" w:hAnsi="Courier New" w:cs="Courier New"/>
-                <w:i/>
-                <w:iCs/>
-                <w:color w:val="3A7C22" w:themeColor="accent6" w:themeShade="BF"/>
-                <w:sz w:val="16"/>
-                <w:szCs w:val="16"/>
-              </w:rPr>
-              <w:t xml:space="preserve"># </w:t>
-            </w:r>
-            <w:r>
-              <w:rPr>
                 <w:rFonts w:ascii="Courier New" w:eastAsia="Courier New" w:hAnsi="Courier New" w:cs="Courier New"/>
                 <w:b/>
                 <w:bCs/>
@@ -2257,7 +2243,17 @@
                 <w:sz w:val="16"/>
                 <w:szCs w:val="16"/>
               </w:rPr>
-              <w:t xml:space="preserve">data from current date </w:t>
+            </w:pPr>
+            <w:r>
+              <w:rPr>
+                <w:rFonts w:ascii="Courier New" w:eastAsia="Courier New" w:hAnsi="Courier New" w:cs="Courier New"/>
+                <w:i/>
+                <w:iCs/>
+                <w:color w:val="3A7C22" w:themeColor="accent6" w:themeShade="BF"/>
+                <w:sz w:val="16"/>
+                <w:szCs w:val="16"/>
+              </w:rPr>
+              <w:t xml:space="preserve"># </w:t>
             </w:r>
             <w:r>
               <w:rPr>
@@ -2270,9 +2266,8 @@
                 <w:sz w:val="16"/>
                 <w:szCs w:val="16"/>
               </w:rPr>
-              <w:t xml:space="preserve">up </w:t>
-            </w:r>
-            <w:proofErr w:type="gramStart"/>
+              <w:t xml:space="preserve">data from current date </w:t>
+            </w:r>
             <w:r>
               <w:rPr>
                 <w:rFonts w:ascii="Courier New" w:eastAsia="Courier New" w:hAnsi="Courier New" w:cs="Courier New"/>
@@ -2284,7 +2279,7 @@
                 <w:sz w:val="16"/>
                 <w:szCs w:val="16"/>
               </w:rPr>
-              <w:t xml:space="preserve">to </w:t>
+              <w:t xml:space="preserve">up to </w:t>
             </w:r>
             <w:r>
               <w:rPr>
@@ -2297,9 +2292,39 @@
                 <w:sz w:val="16"/>
                 <w:szCs w:val="16"/>
               </w:rPr>
-              <w:t xml:space="preserve"> 12</w:t>
-            </w:r>
-            <w:proofErr w:type="gramEnd"/>
+              <w:t xml:space="preserve"> 12 month back data</w:t>
+            </w:r>
+          </w:p>
+          <w:p>
+            <w:pPr>
+              <w:ind w:left="280"/>
+              <w:rPr>
+                <w:sz w:val="16"/>
+                <w:szCs w:val="16"/>
+              </w:rPr>
+            </w:pPr>
+            <w:r>
+              <w:rPr>
+                <w:rFonts w:ascii="Courier New" w:eastAsia="Courier New" w:hAnsi="Courier New" w:cs="Courier New"/>
+                <w:i/>
+                <w:iCs/>
+                <w:color w:val="3A7C22" w:themeColor="accent6" w:themeShade="BF"/>
+                <w:sz w:val="14"/>
+                <w:szCs w:val="14"/>
+              </w:rPr>
+              <w:t xml:space="preserve">Exp : </w:t>
+            </w:r>
+            <w:r>
+              <w:rPr>
+                <w:rFonts w:ascii="Courier New" w:eastAsia="Courier New" w:hAnsi="Courier New" w:cs="Courier New"/>
+                <w:i/>
+                <w:iCs/>
+                <w:color w:val="3A7C22" w:themeColor="accent6" w:themeShade="BF"/>
+                <w:sz w:val="14"/>
+                <w:szCs w:val="14"/>
+              </w:rPr>
+              <w:t xml:space="preserve">it returns the </w:t>
+            </w:r>
             <w:r>
               <w:rPr>
                 <w:rFonts w:ascii="Courier New" w:eastAsia="Courier New" w:hAnsi="Courier New" w:cs="Courier New"/>
@@ -2308,203 +2333,247 @@
                 <w:i/>
                 <w:iCs/>
                 <w:color w:val="3A7C22" w:themeColor="accent6" w:themeShade="BF"/>
+                <w:sz w:val="14"/>
+                <w:szCs w:val="14"/>
+              </w:rPr>
+              <w:t>sum of all sales from 29/04/2024 to 29/04/2025</w:t>
+            </w:r>
+            <w:r>
+              <w:rPr>
+                <w:rFonts w:ascii="Courier New" w:eastAsia="Courier New" w:hAnsi="Courier New" w:cs="Courier New"/>
+                <w:i/>
+                <w:iCs/>
+                <w:color w:val="3A7C22" w:themeColor="accent6" w:themeShade="BF"/>
+                <w:sz w:val="14"/>
+                <w:szCs w:val="14"/>
+              </w:rPr>
+              <w:t xml:space="preserve"> (if today is </w:t>
+            </w:r>
+            <w:r>
+              <w:rPr>
+                <w:rFonts w:ascii="Courier New" w:eastAsia="Courier New" w:hAnsi="Courier New" w:cs="Courier New"/>
+                <w:b/>
+                <w:bCs/>
+                <w:i/>
+                <w:iCs/>
+                <w:color w:val="3A7C22" w:themeColor="accent6" w:themeShade="BF"/>
+                <w:sz w:val="14"/>
+                <w:szCs w:val="14"/>
+              </w:rPr>
+              <w:t>29/04/2025</w:t>
+            </w:r>
+            <w:r>
+              <w:rPr>
+                <w:rFonts w:ascii="Courier New" w:eastAsia="Courier New" w:hAnsi="Courier New" w:cs="Courier New"/>
+                <w:i/>
+                <w:iCs/>
+                <w:color w:val="3A7C22" w:themeColor="accent6" w:themeShade="BF"/>
+                <w:sz w:val="14"/>
+                <w:szCs w:val="14"/>
+              </w:rPr>
+              <w:t>)</w:t>
+            </w:r>
+          </w:p>
+        </w:tc>
+      </w:tr>
+      <w:tr>
+        <w:tc>
+          <w:tcPr>
+            <w:tcW w:w="9026" w:type="dxa"/>
+            <w:tcBorders>
+              <w:top w:val="none" w:sz="0" w:space="0" w:color="FFFFFF"/>
+              <w:left w:val="none" w:sz="0" w:space="0" w:color="FFFFFF"/>
+              <w:bottom w:val="none" w:sz="0" w:space="0" w:color="FFFFFF"/>
+              <w:right w:val="none" w:sz="0" w:space="0" w:color="FFFFFF"/>
+            </w:tcBorders>
+            <w:shd w:val="clear" w:color="auto" w:fill="F2F2F2"/>
+            <w:tcMar>
+              <w:top w:w="0" w:type="dxa"/>
+              <w:left w:w="200" w:type="dxa"/>
+              <w:bottom w:w="0" w:type="dxa"/>
+              <w:right w:w="200" w:type="dxa"/>
+            </w:tcMar>
+          </w:tcPr>
+          <w:p>
+            <w:pPr>
+              <w:ind w:left="280"/>
+              <w:rPr>
                 <w:sz w:val="16"/>
                 <w:szCs w:val="16"/>
               </w:rPr>
-              <w:t xml:space="preserve"> month back data</w:t>
-            </w:r>
-          </w:p>
-        </w:tc>
-      </w:tr>
-      <w:tr>
-        <w:tc>
-          <w:tcPr>
-            <w:tcW w:w="9026" w:type="dxa"/>
-            <w:tcBorders>
-              <w:top w:val="none" w:sz="0" w:space="0" w:color="FFFFFF"/>
-              <w:left w:val="none" w:sz="0" w:space="0" w:color="FFFFFF"/>
-              <w:bottom w:val="none" w:sz="0" w:space="0" w:color="FFFFFF"/>
-              <w:right w:val="none" w:sz="0" w:space="0" w:color="FFFFFF"/>
-            </w:tcBorders>
-            <w:shd w:val="clear" w:color="auto" w:fill="F2F2F2"/>
-            <w:tcMar>
-              <w:top w:w="0" w:type="dxa"/>
-              <w:left w:w="200" w:type="dxa"/>
-              <w:bottom w:w="0" w:type="dxa"/>
-              <w:right w:w="200" w:type="dxa"/>
-            </w:tcMar>
-          </w:tcPr>
-          <w:p>
-            <w:pPr>
-              <w:ind w:left="280"/>
-              <w:rPr>
+            </w:pPr>
+            <w:r>
+              <w:rPr>
+                <w:rFonts w:ascii="Courier New" w:eastAsia="Courier New" w:hAnsi="Courier New" w:cs="Courier New"/>
+                <w:color w:val="1A1A2E"/>
                 <w:sz w:val="16"/>
                 <w:szCs w:val="16"/>
               </w:rPr>
-            </w:pPr>
-            <w:r>
-              <w:rPr>
-                <w:rFonts w:ascii="Courier New" w:eastAsia="Courier New" w:hAnsi="Courier New" w:cs="Courier New"/>
-                <w:color w:val="1A1A2E"/>
+              <w:t>Sales Rolling 12M =</w:t>
+            </w:r>
+          </w:p>
+        </w:tc>
+      </w:tr>
+      <w:tr>
+        <w:tc>
+          <w:tcPr>
+            <w:tcW w:w="9026" w:type="dxa"/>
+            <w:tcBorders>
+              <w:top w:val="none" w:sz="0" w:space="0" w:color="FFFFFF"/>
+              <w:left w:val="none" w:sz="0" w:space="0" w:color="FFFFFF"/>
+              <w:bottom w:val="none" w:sz="0" w:space="0" w:color="FFFFFF"/>
+              <w:right w:val="none" w:sz="0" w:space="0" w:color="FFFFFF"/>
+            </w:tcBorders>
+            <w:shd w:val="clear" w:color="auto" w:fill="F2F2F2"/>
+            <w:tcMar>
+              <w:top w:w="0" w:type="dxa"/>
+              <w:left w:w="200" w:type="dxa"/>
+              <w:bottom w:w="0" w:type="dxa"/>
+              <w:right w:w="200" w:type="dxa"/>
+            </w:tcMar>
+          </w:tcPr>
+          <w:p>
+            <w:pPr>
+              <w:ind w:left="280"/>
+              <w:rPr>
                 <w:sz w:val="16"/>
                 <w:szCs w:val="16"/>
               </w:rPr>
-              <w:t>Sales Rolling 12M =</w:t>
-            </w:r>
-          </w:p>
-        </w:tc>
-      </w:tr>
-      <w:tr>
-        <w:tc>
-          <w:tcPr>
-            <w:tcW w:w="9026" w:type="dxa"/>
-            <w:tcBorders>
-              <w:top w:val="none" w:sz="0" w:space="0" w:color="FFFFFF"/>
-              <w:left w:val="none" w:sz="0" w:space="0" w:color="FFFFFF"/>
-              <w:bottom w:val="none" w:sz="0" w:space="0" w:color="FFFFFF"/>
-              <w:right w:val="none" w:sz="0" w:space="0" w:color="FFFFFF"/>
-            </w:tcBorders>
-            <w:shd w:val="clear" w:color="auto" w:fill="F2F2F2"/>
-            <w:tcMar>
-              <w:top w:w="0" w:type="dxa"/>
-              <w:left w:w="200" w:type="dxa"/>
-              <w:bottom w:w="0" w:type="dxa"/>
-              <w:right w:w="200" w:type="dxa"/>
-            </w:tcMar>
-          </w:tcPr>
-          <w:p>
-            <w:pPr>
-              <w:ind w:left="280"/>
-              <w:rPr>
+            </w:pPr>
+            <w:r>
+              <w:rPr>
+                <w:rFonts w:ascii="Courier New" w:eastAsia="Courier New" w:hAnsi="Courier New" w:cs="Courier New"/>
+                <w:color w:val="1A1A2E"/>
                 <w:sz w:val="16"/>
                 <w:szCs w:val="16"/>
               </w:rPr>
-            </w:pPr>
-            <w:r>
-              <w:rPr>
-                <w:rFonts w:ascii="Courier New" w:eastAsia="Courier New" w:hAnsi="Courier New" w:cs="Courier New"/>
-                <w:color w:val="1A1A2E"/>
+              <w:t>CALCULATE(</w:t>
+            </w:r>
+          </w:p>
+        </w:tc>
+      </w:tr>
+      <w:tr>
+        <w:tc>
+          <w:tcPr>
+            <w:tcW w:w="9026" w:type="dxa"/>
+            <w:tcBorders>
+              <w:top w:val="none" w:sz="0" w:space="0" w:color="FFFFFF"/>
+              <w:left w:val="none" w:sz="0" w:space="0" w:color="FFFFFF"/>
+              <w:bottom w:val="none" w:sz="0" w:space="0" w:color="FFFFFF"/>
+              <w:right w:val="none" w:sz="0" w:space="0" w:color="FFFFFF"/>
+            </w:tcBorders>
+            <w:shd w:val="clear" w:color="auto" w:fill="F2F2F2"/>
+            <w:tcMar>
+              <w:top w:w="0" w:type="dxa"/>
+              <w:left w:w="200" w:type="dxa"/>
+              <w:bottom w:w="0" w:type="dxa"/>
+              <w:right w:w="200" w:type="dxa"/>
+            </w:tcMar>
+          </w:tcPr>
+          <w:p>
+            <w:pPr>
+              <w:ind w:left="280"/>
+              <w:rPr>
                 <w:sz w:val="16"/>
                 <w:szCs w:val="16"/>
               </w:rPr>
-              <w:t>CALCULATE(</w:t>
-            </w:r>
-          </w:p>
-        </w:tc>
-      </w:tr>
-      <w:tr>
-        <w:tc>
-          <w:tcPr>
-            <w:tcW w:w="9026" w:type="dxa"/>
-            <w:tcBorders>
-              <w:top w:val="none" w:sz="0" w:space="0" w:color="FFFFFF"/>
-              <w:left w:val="none" w:sz="0" w:space="0" w:color="FFFFFF"/>
-              <w:bottom w:val="none" w:sz="0" w:space="0" w:color="FFFFFF"/>
-              <w:right w:val="none" w:sz="0" w:space="0" w:color="FFFFFF"/>
-            </w:tcBorders>
-            <w:shd w:val="clear" w:color="auto" w:fill="F2F2F2"/>
-            <w:tcMar>
-              <w:top w:w="0" w:type="dxa"/>
-              <w:left w:w="200" w:type="dxa"/>
-              <w:bottom w:w="0" w:type="dxa"/>
-              <w:right w:w="200" w:type="dxa"/>
-            </w:tcMar>
-          </w:tcPr>
-          <w:p>
-            <w:pPr>
-              <w:ind w:left="280"/>
-              <w:rPr>
+            </w:pPr>
+            <w:r>
+              <w:rPr>
+                <w:rFonts w:ascii="Courier New" w:eastAsia="Courier New" w:hAnsi="Courier New" w:cs="Courier New"/>
+                <w:color w:val="1A1A2E"/>
                 <w:sz w:val="16"/>
                 <w:szCs w:val="16"/>
               </w:rPr>
-            </w:pPr>
-            <w:r>
-              <w:rPr>
-                <w:rFonts w:ascii="Courier New" w:eastAsia="Courier New" w:hAnsi="Courier New" w:cs="Courier New"/>
-                <w:color w:val="1A1A2E"/>
+              <w:t xml:space="preserve">    SUM(Sales[Amount]),</w:t>
+            </w:r>
+          </w:p>
+        </w:tc>
+      </w:tr>
+      <w:tr>
+        <w:tc>
+          <w:tcPr>
+            <w:tcW w:w="9026" w:type="dxa"/>
+            <w:tcBorders>
+              <w:top w:val="none" w:sz="0" w:space="0" w:color="FFFFFF"/>
+              <w:left w:val="none" w:sz="0" w:space="0" w:color="FFFFFF"/>
+              <w:bottom w:val="none" w:sz="0" w:space="0" w:color="FFFFFF"/>
+              <w:right w:val="none" w:sz="0" w:space="0" w:color="FFFFFF"/>
+            </w:tcBorders>
+            <w:shd w:val="clear" w:color="auto" w:fill="F2F2F2"/>
+            <w:tcMar>
+              <w:top w:w="0" w:type="dxa"/>
+              <w:left w:w="200" w:type="dxa"/>
+              <w:bottom w:w="0" w:type="dxa"/>
+              <w:right w:w="200" w:type="dxa"/>
+            </w:tcMar>
+          </w:tcPr>
+          <w:p>
+            <w:pPr>
+              <w:ind w:left="280"/>
+              <w:rPr>
                 <w:sz w:val="16"/>
                 <w:szCs w:val="16"/>
               </w:rPr>
-              <w:t xml:space="preserve">    SUM(Sales[Amount]),</w:t>
-            </w:r>
-          </w:p>
-        </w:tc>
-      </w:tr>
-      <w:tr>
-        <w:tc>
-          <w:tcPr>
-            <w:tcW w:w="9026" w:type="dxa"/>
-            <w:tcBorders>
-              <w:top w:val="none" w:sz="0" w:space="0" w:color="FFFFFF"/>
-              <w:left w:val="none" w:sz="0" w:space="0" w:color="FFFFFF"/>
-              <w:bottom w:val="none" w:sz="0" w:space="0" w:color="FFFFFF"/>
-              <w:right w:val="none" w:sz="0" w:space="0" w:color="FFFFFF"/>
-            </w:tcBorders>
-            <w:shd w:val="clear" w:color="auto" w:fill="F2F2F2"/>
-            <w:tcMar>
-              <w:top w:w="0" w:type="dxa"/>
-              <w:left w:w="200" w:type="dxa"/>
-              <w:bottom w:w="0" w:type="dxa"/>
-              <w:right w:w="200" w:type="dxa"/>
-            </w:tcMar>
-          </w:tcPr>
-          <w:p>
-            <w:pPr>
-              <w:ind w:left="280"/>
-              <w:rPr>
+            </w:pPr>
+            <w:r>
+              <w:rPr>
+                <w:rFonts w:ascii="Courier New" w:eastAsia="Courier New" w:hAnsi="Courier New" w:cs="Courier New"/>
+                <w:color w:val="1A1A2E"/>
                 <w:sz w:val="16"/>
                 <w:szCs w:val="16"/>
               </w:rPr>
-            </w:pPr>
-            <w:r>
+              <w:t xml:space="preserve">    DATESINPERIOD('Date'[Date], LASTDATE('Date'[Date]), -12, MONTH)</w:t>
+            </w:r>
+          </w:p>
+        </w:tc>
+      </w:tr>
+      <w:tr>
+        <w:tc>
+          <w:tcPr>
+            <w:tcW w:w="9026" w:type="dxa"/>
+            <w:tcBorders>
+              <w:top w:val="none" w:sz="0" w:space="0" w:color="FFFFFF"/>
+              <w:left w:val="none" w:sz="0" w:space="0" w:color="FFFFFF"/>
+              <w:bottom w:val="none" w:sz="0" w:space="0" w:color="FFFFFF"/>
+              <w:right w:val="none" w:sz="0" w:space="0" w:color="FFFFFF"/>
+            </w:tcBorders>
+            <w:shd w:val="clear" w:color="auto" w:fill="F2F2F2"/>
+            <w:tcMar>
+              <w:top w:w="0" w:type="dxa"/>
+              <w:left w:w="200" w:type="dxa"/>
+              <w:bottom w:w="0" w:type="dxa"/>
+              <w:right w:w="200" w:type="dxa"/>
+            </w:tcMar>
+          </w:tcPr>
+          <w:p>
+            <w:pPr>
+              <w:ind w:left="280"/>
               <w:rPr>
                 <w:rFonts w:ascii="Courier New" w:eastAsia="Courier New" w:hAnsi="Courier New" w:cs="Courier New"/>
                 <w:color w:val="1A1A2E"/>
                 <w:sz w:val="16"/>
                 <w:szCs w:val="16"/>
               </w:rPr>
-              <w:t xml:space="preserve">    DATESINPERIOD('Date'[Date], LASTDATE('Date'[Date]), -12, MONTH)</w:t>
-            </w:r>
-          </w:p>
-        </w:tc>
-      </w:tr>
-      <w:tr>
-        <w:tc>
-          <w:tcPr>
-            <w:tcW w:w="9026" w:type="dxa"/>
-            <w:tcBorders>
-              <w:top w:val="none" w:sz="0" w:space="0" w:color="FFFFFF"/>
-              <w:left w:val="none" w:sz="0" w:space="0" w:color="FFFFFF"/>
-              <w:bottom w:val="none" w:sz="0" w:space="0" w:color="FFFFFF"/>
-              <w:right w:val="none" w:sz="0" w:space="0" w:color="FFFFFF"/>
-            </w:tcBorders>
-            <w:shd w:val="clear" w:color="auto" w:fill="F2F2F2"/>
-            <w:tcMar>
-              <w:top w:w="0" w:type="dxa"/>
-              <w:left w:w="200" w:type="dxa"/>
-              <w:bottom w:w="0" w:type="dxa"/>
-              <w:right w:w="200" w:type="dxa"/>
-            </w:tcMar>
-          </w:tcPr>
-          <w:p>
-            <w:pPr>
-              <w:ind w:left="280"/>
+            </w:pPr>
+            <w:r>
               <w:rPr>
                 <w:rFonts w:ascii="Courier New" w:eastAsia="Courier New" w:hAnsi="Courier New" w:cs="Courier New"/>
                 <w:color w:val="1A1A2E"/>
                 <w:sz w:val="16"/>
                 <w:szCs w:val="16"/>
               </w:rPr>
-            </w:pPr>
-            <w:r>
-              <w:rPr>
-                <w:rFonts w:ascii="Courier New" w:eastAsia="Courier New" w:hAnsi="Courier New" w:cs="Courier New"/>
-                <w:color w:val="1A1A2E"/>
+              <w:t>)</w:t>
+            </w:r>
+          </w:p>
+          <w:p>
+            <w:pPr>
+              <w:ind w:left="280"/>
+              <w:rPr>
                 <w:sz w:val="16"/>
                 <w:szCs w:val="16"/>
               </w:rPr>
-              <w:t>)</w:t>
-            </w:r>
+            </w:pPr>
           </w:p>
           <w:p>
             <w:pPr>
@@ -2523,131 +2592,59 @@
                 <w:szCs w:val="16"/>
               </w:rPr>
             </w:pPr>
-          </w:p>
-          <w:p>
-            <w:pPr>
-              <w:ind w:left="280"/>
-              <w:rPr>
+            <w:r>
+              <w:rPr>
+                <w:rFonts w:ascii="Courier New" w:eastAsia="Courier New" w:hAnsi="Courier New" w:cs="Courier New"/>
+                <w:color w:val="1A1A2E"/>
                 <w:sz w:val="16"/>
                 <w:szCs w:val="16"/>
               </w:rPr>
-            </w:pPr>
-            <w:r>
-              <w:rPr>
-                <w:rFonts w:ascii="Courier New" w:eastAsia="Courier New" w:hAnsi="Courier New" w:cs="Courier New"/>
-                <w:color w:val="1A1A2E"/>
+              <w:t>// Calculation group</w:t>
+            </w:r>
+            <w:r>
+              <w:rPr>
                 <w:sz w:val="16"/>
                 <w:szCs w:val="16"/>
               </w:rPr>
-              <w:t>// Calculation group</w:t>
-            </w:r>
-            <w:r>
+              <w:t xml:space="preserve"> </w:t>
+            </w:r>
+          </w:p>
+          <w:p>
+            <w:pPr>
+              <w:ind w:left="280"/>
               <w:rPr>
                 <w:sz w:val="16"/>
                 <w:szCs w:val="16"/>
               </w:rPr>
-              <w:t xml:space="preserve"> </w:t>
-            </w:r>
-          </w:p>
-          <w:p>
-            <w:pPr>
-              <w:ind w:left="280"/>
+            </w:pPr>
+            <w:r>
               <w:rPr>
                 <w:sz w:val="16"/>
                 <w:szCs w:val="16"/>
               </w:rPr>
-            </w:pPr>
-            <w:r>
+              <w:t>Time intelligence function acting as a template to automatically create time intelligence Measures like YTD, MTD,YOY  for any aggregated value (total amount , qty , revenue , margin...)</w:t>
+            </w:r>
+          </w:p>
+          <w:p>
+            <w:pPr>
+              <w:ind w:left="280"/>
               <w:rPr>
                 <w:sz w:val="16"/>
                 <w:szCs w:val="16"/>
               </w:rPr>
-              <w:t xml:space="preserve">Time intelligence function acting as a template to automatically create time intelligence Measures like YTD, </w:t>
-            </w:r>
-            <w:proofErr w:type="gramStart"/>
-            <w:r>
+            </w:pPr>
+          </w:p>
+          <w:p>
+            <w:pPr>
+              <w:ind w:left="280"/>
               <w:rPr>
                 <w:sz w:val="16"/>
                 <w:szCs w:val="16"/>
               </w:rPr>
-              <w:t>MTD,YOY</w:t>
-            </w:r>
-            <w:proofErr w:type="gramEnd"/>
-            <w:r>
-              <w:rPr>
-                <w:sz w:val="16"/>
-                <w:szCs w:val="16"/>
-              </w:rPr>
-              <w:t xml:space="preserve">  for any aggregated value (total </w:t>
-            </w:r>
-            <w:proofErr w:type="gramStart"/>
-            <w:r>
-              <w:rPr>
-                <w:sz w:val="16"/>
-                <w:szCs w:val="16"/>
-              </w:rPr>
-              <w:t>amount ,</w:t>
-            </w:r>
-            <w:proofErr w:type="gramEnd"/>
-            <w:r>
-              <w:rPr>
-                <w:sz w:val="16"/>
-                <w:szCs w:val="16"/>
-              </w:rPr>
-              <w:t xml:space="preserve"> </w:t>
-            </w:r>
-            <w:proofErr w:type="gramStart"/>
-            <w:r>
-              <w:rPr>
-                <w:sz w:val="16"/>
-                <w:szCs w:val="16"/>
-              </w:rPr>
-              <w:t>qty ,</w:t>
-            </w:r>
-            <w:proofErr w:type="gramEnd"/>
-            <w:r>
-              <w:rPr>
-                <w:sz w:val="16"/>
-                <w:szCs w:val="16"/>
-              </w:rPr>
-              <w:t xml:space="preserve"> </w:t>
-            </w:r>
-            <w:proofErr w:type="gramStart"/>
-            <w:r>
-              <w:rPr>
-                <w:sz w:val="16"/>
-                <w:szCs w:val="16"/>
-              </w:rPr>
-              <w:t>revenue ,</w:t>
-            </w:r>
-            <w:proofErr w:type="gramEnd"/>
-            <w:r>
-              <w:rPr>
-                <w:sz w:val="16"/>
-                <w:szCs w:val="16"/>
-              </w:rPr>
-              <w:t xml:space="preserve"> margin...)</w:t>
-            </w:r>
-          </w:p>
-          <w:p>
-            <w:pPr>
-              <w:ind w:left="280"/>
-              <w:rPr>
-                <w:sz w:val="16"/>
-                <w:szCs w:val="16"/>
-              </w:rPr>
-            </w:pPr>
-          </w:p>
-          <w:p>
-            <w:pPr>
-              <w:ind w:left="280"/>
-              <w:rPr>
-                <w:sz w:val="16"/>
-                <w:szCs w:val="16"/>
-              </w:rPr>
-            </w:pPr>
-            <w:r>
-              <w:rPr>
+            </w:pPr>
+            <w:r>
+              <w:rPr>
+                <w:noProof/>
                 <w:sz w:val="16"/>
                 <w:szCs w:val="16"/>
               </w:rPr>
@@ -2689,6 +2686,7 @@
             </w:r>
             <w:r>
               <w:rPr>
+                <w:noProof/>
                 <w:sz w:val="16"/>
                 <w:szCs w:val="16"/>
               </w:rPr>
@@ -2757,6 +2755,7 @@
             </w:pPr>
             <w:r>
               <w:rPr>
+                <w:noProof/>
                 <w:sz w:val="16"/>
                 <w:szCs w:val="16"/>
               </w:rPr>
@@ -3946,31 +3945,7 @@
                 <w:sz w:val="16"/>
                 <w:szCs w:val="16"/>
               </w:rPr>
-              <w:t xml:space="preserve">next rank after 2 </w:t>
-            </w:r>
-            <w:proofErr w:type="gramStart"/>
-            <w:r>
-              <w:rPr>
-                <w:rFonts w:ascii="Courier New" w:eastAsia="Courier New" w:hAnsi="Courier New" w:cs="Courier New"/>
-                <w:i/>
-                <w:iCs/>
-                <w:color w:val="3A7C22" w:themeColor="accent6" w:themeShade="BF"/>
-                <w:sz w:val="16"/>
-                <w:szCs w:val="16"/>
-              </w:rPr>
-              <w:t>product</w:t>
-            </w:r>
-            <w:proofErr w:type="gramEnd"/>
-            <w:r>
-              <w:rPr>
-                <w:rFonts w:ascii="Courier New" w:eastAsia="Courier New" w:hAnsi="Courier New" w:cs="Courier New"/>
-                <w:i/>
-                <w:iCs/>
-                <w:color w:val="3A7C22" w:themeColor="accent6" w:themeShade="BF"/>
-                <w:sz w:val="16"/>
-                <w:szCs w:val="16"/>
-              </w:rPr>
-              <w:t xml:space="preserve"> with a rank of 2 will 4)</w:t>
+              <w:t>next rank after 2 product with a rank of 2 will 4)</w:t>
             </w:r>
           </w:p>
         </w:tc>
@@ -4319,6 +4294,41 @@
               </w:rPr>
               <w:t>// % of Grand Total</w:t>
             </w:r>
+            <w:r>
+              <w:rPr>
+                <w:rFonts w:ascii="Courier New" w:eastAsia="Courier New" w:hAnsi="Courier New" w:cs="Courier New"/>
+                <w:color w:val="1A1A2E"/>
+                <w:sz w:val="18"/>
+                <w:szCs w:val="18"/>
+              </w:rPr>
+              <w:t xml:space="preserve"> </w:t>
+            </w:r>
+            <w:r>
+              <w:rPr>
+                <w:rFonts w:ascii="Courier New" w:eastAsia="Courier New" w:hAnsi="Courier New" w:cs="Courier New"/>
+                <w:b/>
+                <w:bCs/>
+                <w:i/>
+                <w:iCs/>
+                <w:color w:val="4EA72E" w:themeColor="accent6"/>
+                <w:sz w:val="14"/>
+                <w:szCs w:val="14"/>
+              </w:rPr>
+              <w:t>individual sales divided by the global t</w:t>
+            </w:r>
+            <w:r>
+              <w:rPr>
+                <w:rFonts w:ascii="Courier New" w:eastAsia="Courier New" w:hAnsi="Courier New" w:cs="Courier New"/>
+                <w:b/>
+                <w:bCs/>
+                <w:i/>
+                <w:iCs/>
+                <w:color w:val="4EA72E" w:themeColor="accent6"/>
+                <w:sz w:val="14"/>
+                <w:szCs w:val="14"/>
+              </w:rPr>
+              <w:t>otal sales</w:t>
+            </w:r>
           </w:p>
         </w:tc>
       </w:tr>
@@ -4572,6 +4582,12 @@
           <w:p>
             <w:pPr>
               <w:ind w:left="280"/>
+              <w:rPr>
+                <w:rFonts w:ascii="Courier New" w:eastAsia="Courier New" w:hAnsi="Courier New" w:cs="Courier New"/>
+                <w:color w:val="1A1A2E"/>
+                <w:sz w:val="18"/>
+                <w:szCs w:val="18"/>
+              </w:rPr>
             </w:pPr>
             <w:r>
               <w:rPr>
@@ -4581,6 +4597,89 @@
                 <w:szCs w:val="18"/>
               </w:rPr>
               <w:t>// % of Category Total (ALLEXCEPT — keep category filter only)</w:t>
+            </w:r>
+          </w:p>
+          <w:p>
+            <w:pPr>
+              <w:ind w:left="280"/>
+            </w:pPr>
+            <w:r>
+              <w:rPr>
+                <w:rFonts w:ascii="Courier New" w:eastAsia="Courier New" w:hAnsi="Courier New" w:cs="Courier New"/>
+                <w:b/>
+                <w:bCs/>
+                <w:i/>
+                <w:iCs/>
+                <w:color w:val="4EA72E" w:themeColor="accent6"/>
+                <w:sz w:val="14"/>
+                <w:szCs w:val="14"/>
+              </w:rPr>
+              <w:t>individual sales</w:t>
+            </w:r>
+            <w:r>
+              <w:rPr>
+                <w:rFonts w:ascii="Courier New" w:eastAsia="Courier New" w:hAnsi="Courier New" w:cs="Courier New"/>
+                <w:b/>
+                <w:bCs/>
+                <w:i/>
+                <w:iCs/>
+                <w:color w:val="4EA72E" w:themeColor="accent6"/>
+                <w:sz w:val="14"/>
+                <w:szCs w:val="14"/>
+              </w:rPr>
+              <w:t xml:space="preserve"> (in a category)</w:t>
+            </w:r>
+            <w:r>
+              <w:rPr>
+                <w:rFonts w:ascii="Courier New" w:eastAsia="Courier New" w:hAnsi="Courier New" w:cs="Courier New"/>
+                <w:b/>
+                <w:bCs/>
+                <w:i/>
+                <w:iCs/>
+                <w:color w:val="4EA72E" w:themeColor="accent6"/>
+                <w:sz w:val="14"/>
+                <w:szCs w:val="14"/>
+              </w:rPr>
+              <w:t xml:space="preserve"> divided by the global table</w:t>
+            </w:r>
+            <w:r>
+              <w:rPr>
+                <w:rFonts w:ascii="Courier New" w:eastAsia="Courier New" w:hAnsi="Courier New" w:cs="Courier New"/>
+                <w:b/>
+                <w:bCs/>
+                <w:i/>
+                <w:iCs/>
+                <w:color w:val="4EA72E" w:themeColor="accent6"/>
+                <w:sz w:val="14"/>
+                <w:szCs w:val="14"/>
+              </w:rPr>
+              <w:t xml:space="preserve"> sales </w:t>
+            </w:r>
+            <w:r>
+              <w:rPr>
+                <w:rFonts w:ascii="Courier New" w:eastAsia="Courier New" w:hAnsi="Courier New" w:cs="Courier New"/>
+                <w:b/>
+                <w:bCs/>
+                <w:i/>
+                <w:iCs/>
+                <w:color w:val="4EA72E" w:themeColor="accent6"/>
+                <w:sz w:val="14"/>
+                <w:szCs w:val="14"/>
+              </w:rPr>
+              <w:t xml:space="preserve"> of </w:t>
+            </w:r>
+            <w:r>
+              <w:rPr>
+                <w:rFonts w:ascii="Courier New" w:eastAsia="Courier New" w:hAnsi="Courier New" w:cs="Courier New"/>
+                <w:b/>
+                <w:bCs/>
+                <w:i/>
+                <w:iCs/>
+                <w:color w:val="4EA72E" w:themeColor="accent6"/>
+                <w:sz w:val="14"/>
+                <w:szCs w:val="14"/>
+              </w:rPr>
+              <w:t>the corresponding category</w:t>
             </w:r>
           </w:p>
         </w:tc>
@@ -5574,27 +5673,7 @@
                 <w:sz w:val="18"/>
                 <w:szCs w:val="18"/>
               </w:rPr>
-              <w:t xml:space="preserve">VAR </w:t>
-            </w:r>
-            <w:proofErr w:type="spellStart"/>
-            <w:r>
-              <w:rPr>
-                <w:rFonts w:ascii="Courier New" w:eastAsia="Courier New" w:hAnsi="Courier New" w:cs="Courier New"/>
-                <w:color w:val="1A1A2E"/>
-                <w:sz w:val="18"/>
-                <w:szCs w:val="18"/>
-              </w:rPr>
-              <w:t>CurrentSales</w:t>
-            </w:r>
-            <w:proofErr w:type="spellEnd"/>
-            <w:r>
-              <w:rPr>
-                <w:rFonts w:ascii="Courier New" w:eastAsia="Courier New" w:hAnsi="Courier New" w:cs="Courier New"/>
-                <w:color w:val="1A1A2E"/>
-                <w:sz w:val="18"/>
-                <w:szCs w:val="18"/>
-              </w:rPr>
-              <w:t xml:space="preserve">  = SUM(Sales[Amount])</w:t>
+              <w:t>VAR CurrentSales  = SUM(Sales[Amount])</w:t>
             </w:r>
           </w:p>
         </w:tc>
@@ -5662,27 +5741,7 @@
                 <w:sz w:val="18"/>
                 <w:szCs w:val="18"/>
               </w:rPr>
-              <w:t xml:space="preserve">VAR Growth        = </w:t>
-            </w:r>
-            <w:proofErr w:type="spellStart"/>
-            <w:r>
-              <w:rPr>
-                <w:rFonts w:ascii="Courier New" w:eastAsia="Courier New" w:hAnsi="Courier New" w:cs="Courier New"/>
-                <w:color w:val="1A1A2E"/>
-                <w:sz w:val="18"/>
-                <w:szCs w:val="18"/>
-              </w:rPr>
-              <w:t>CurrentSales</w:t>
-            </w:r>
-            <w:proofErr w:type="spellEnd"/>
-            <w:r>
-              <w:rPr>
-                <w:rFonts w:ascii="Courier New" w:eastAsia="Courier New" w:hAnsi="Courier New" w:cs="Courier New"/>
-                <w:color w:val="1A1A2E"/>
-                <w:sz w:val="18"/>
-                <w:szCs w:val="18"/>
-              </w:rPr>
-              <w:t xml:space="preserve"> - PreviousSales</w:t>
+              <w:t>VAR Growth        = CurrentSales - PreviousSales</w:t>
             </w:r>
           </w:p>
         </w:tc>
@@ -6971,39 +7030,8 @@
                 <w:sz w:val="18"/>
                 <w:szCs w:val="18"/>
               </w:rPr>
-              <w:t xml:space="preserve">// Example: Sales table has </w:t>
-            </w:r>
-            <w:proofErr w:type="spellStart"/>
-            <w:r>
-              <w:rPr>
-                <w:rFonts w:ascii="Courier New" w:eastAsia="Courier New" w:hAnsi="Courier New" w:cs="Courier New"/>
-                <w:color w:val="1A1A2E"/>
-                <w:sz w:val="18"/>
-                <w:szCs w:val="18"/>
-              </w:rPr>
-              <w:t>OrderDate</w:t>
-            </w:r>
-            <w:proofErr w:type="spellEnd"/>
-            <w:r>
-              <w:rPr>
-                <w:rFonts w:ascii="Courier New" w:eastAsia="Courier New" w:hAnsi="Courier New" w:cs="Courier New"/>
-                <w:color w:val="1A1A2E"/>
-                <w:sz w:val="18"/>
-                <w:szCs w:val="18"/>
-              </w:rPr>
-              <w:t xml:space="preserve"> and </w:t>
-            </w:r>
-            <w:proofErr w:type="spellStart"/>
-            <w:r>
-              <w:rPr>
-                <w:rFonts w:ascii="Courier New" w:eastAsia="Courier New" w:hAnsi="Courier New" w:cs="Courier New"/>
-                <w:color w:val="1A1A2E"/>
-                <w:sz w:val="18"/>
-                <w:szCs w:val="18"/>
-              </w:rPr>
-              <w:t>ShipDate</w:t>
-            </w:r>
-            <w:proofErr w:type="spellEnd"/>
+              <w:t>// Example: Sales table has OrderDate and ShipDate</w:t>
+            </w:r>
           </w:p>
         </w:tc>
       </w:tr>
@@ -7070,27 +7098,7 @@
                 <w:sz w:val="18"/>
                 <w:szCs w:val="18"/>
               </w:rPr>
-              <w:t xml:space="preserve">// This measure uses the </w:t>
-            </w:r>
-            <w:proofErr w:type="spellStart"/>
-            <w:r>
-              <w:rPr>
-                <w:rFonts w:ascii="Courier New" w:eastAsia="Courier New" w:hAnsi="Courier New" w:cs="Courier New"/>
-                <w:color w:val="1A1A2E"/>
-                <w:sz w:val="18"/>
-                <w:szCs w:val="18"/>
-              </w:rPr>
-              <w:t>ShipDate</w:t>
-            </w:r>
-            <w:proofErr w:type="spellEnd"/>
-            <w:r>
-              <w:rPr>
-                <w:rFonts w:ascii="Courier New" w:eastAsia="Courier New" w:hAnsi="Courier New" w:cs="Courier New"/>
-                <w:color w:val="1A1A2E"/>
-                <w:sz w:val="18"/>
-                <w:szCs w:val="18"/>
-              </w:rPr>
-              <w:t xml:space="preserve"> relationship instead</w:t>
+              <w:t>// This measure uses the ShipDate relationship instead</w:t>
             </w:r>
           </w:p>
         </w:tc>
@@ -7226,27 +7234,7 @@
                 <w:sz w:val="18"/>
                 <w:szCs w:val="18"/>
               </w:rPr>
-              <w:t xml:space="preserve">    USERELATIONSHIP(Sales[</w:t>
-            </w:r>
-            <w:proofErr w:type="spellStart"/>
-            <w:r>
-              <w:rPr>
-                <w:rFonts w:ascii="Courier New" w:eastAsia="Courier New" w:hAnsi="Courier New" w:cs="Courier New"/>
-                <w:color w:val="1A1A2E"/>
-                <w:sz w:val="18"/>
-                <w:szCs w:val="18"/>
-              </w:rPr>
-              <w:t>ShipDate</w:t>
-            </w:r>
-            <w:proofErr w:type="spellEnd"/>
-            <w:r>
-              <w:rPr>
-                <w:rFonts w:ascii="Courier New" w:eastAsia="Courier New" w:hAnsi="Courier New" w:cs="Courier New"/>
-                <w:color w:val="1A1A2E"/>
-                <w:sz w:val="18"/>
-                <w:szCs w:val="18"/>
-              </w:rPr>
-              <w:t>], 'Date'[Date])</w:t>
+              <w:t xml:space="preserve">    USERELATIONSHIP(Sales[ShipDate], 'Date'[Date])</w:t>
             </w:r>
           </w:p>
         </w:tc>
@@ -7475,27 +7463,7 @@
                 <w:sz w:val="18"/>
                 <w:szCs w:val="18"/>
               </w:rPr>
-              <w:t xml:space="preserve">    USERELATIONSHIP(Sales[</w:t>
-            </w:r>
-            <w:proofErr w:type="spellStart"/>
-            <w:r>
-              <w:rPr>
-                <w:rFonts w:ascii="Courier New" w:eastAsia="Courier New" w:hAnsi="Courier New" w:cs="Courier New"/>
-                <w:color w:val="1A1A2E"/>
-                <w:sz w:val="18"/>
-                <w:szCs w:val="18"/>
-              </w:rPr>
-              <w:t>ShipDate</w:t>
-            </w:r>
-            <w:proofErr w:type="spellEnd"/>
-            <w:r>
-              <w:rPr>
-                <w:rFonts w:ascii="Courier New" w:eastAsia="Courier New" w:hAnsi="Courier New" w:cs="Courier New"/>
-                <w:color w:val="1A1A2E"/>
-                <w:sz w:val="18"/>
-                <w:szCs w:val="18"/>
-              </w:rPr>
-              <w:t>], 'Date'[Date])</w:t>
+              <w:t xml:space="preserve">    USERELATIONSHIP(Sales[ShipDate], 'Date'[Date])</w:t>
             </w:r>
           </w:p>
         </w:tc>
@@ -9742,27 +9710,7 @@
                 <w:sz w:val="18"/>
                 <w:szCs w:val="18"/>
               </w:rPr>
-              <w:t xml:space="preserve">VAR </w:t>
-            </w:r>
-            <w:proofErr w:type="spellStart"/>
-            <w:r>
-              <w:rPr>
-                <w:rFonts w:ascii="Courier New" w:eastAsia="Courier New" w:hAnsi="Courier New" w:cs="Courier New"/>
-                <w:color w:val="1A1A2E"/>
-                <w:sz w:val="18"/>
-                <w:szCs w:val="18"/>
-              </w:rPr>
-              <w:t>SelectedProducts</w:t>
-            </w:r>
-            <w:proofErr w:type="spellEnd"/>
-            <w:r>
-              <w:rPr>
-                <w:rFonts w:ascii="Courier New" w:eastAsia="Courier New" w:hAnsi="Courier New" w:cs="Courier New"/>
-                <w:color w:val="1A1A2E"/>
-                <w:sz w:val="18"/>
-                <w:szCs w:val="18"/>
-              </w:rPr>
-              <w:t xml:space="preserve"> =</w:t>
+              <w:t>VAR SelectedProducts =</w:t>
             </w:r>
           </w:p>
         </w:tc>
@@ -9830,27 +9778,7 @@
                 <w:sz w:val="18"/>
                 <w:szCs w:val="18"/>
               </w:rPr>
-              <w:t xml:space="preserve">        VALUES(Products[</w:t>
-            </w:r>
-            <w:proofErr w:type="spellStart"/>
-            <w:r>
-              <w:rPr>
-                <w:rFonts w:ascii="Courier New" w:eastAsia="Courier New" w:hAnsi="Courier New" w:cs="Courier New"/>
-                <w:color w:val="1A1A2E"/>
-                <w:sz w:val="18"/>
-                <w:szCs w:val="18"/>
-              </w:rPr>
-              <w:t>ProductKey</w:t>
-            </w:r>
-            <w:proofErr w:type="spellEnd"/>
-            <w:r>
-              <w:rPr>
-                <w:rFonts w:ascii="Courier New" w:eastAsia="Courier New" w:hAnsi="Courier New" w:cs="Courier New"/>
-                <w:color w:val="1A1A2E"/>
-                <w:sz w:val="18"/>
-                <w:szCs w:val="18"/>
-              </w:rPr>
-              <w:t>]),</w:t>
+              <w:t xml:space="preserve">        VALUES(Products[ProductKey]),</w:t>
             </w:r>
           </w:p>
         </w:tc>
@@ -10054,47 +9982,7 @@
                 <w:sz w:val="18"/>
                 <w:szCs w:val="18"/>
               </w:rPr>
-              <w:t xml:space="preserve">    TREATAS(</w:t>
-            </w:r>
-            <w:proofErr w:type="spellStart"/>
-            <w:r>
-              <w:rPr>
-                <w:rFonts w:ascii="Courier New" w:eastAsia="Courier New" w:hAnsi="Courier New" w:cs="Courier New"/>
-                <w:color w:val="1A1A2E"/>
-                <w:sz w:val="18"/>
-                <w:szCs w:val="18"/>
-              </w:rPr>
-              <w:t>SelectedProducts</w:t>
-            </w:r>
-            <w:proofErr w:type="spellEnd"/>
-            <w:r>
-              <w:rPr>
-                <w:rFonts w:ascii="Courier New" w:eastAsia="Courier New" w:hAnsi="Courier New" w:cs="Courier New"/>
-                <w:color w:val="1A1A2E"/>
-                <w:sz w:val="18"/>
-                <w:szCs w:val="18"/>
-              </w:rPr>
-              <w:t>, Budget[</w:t>
-            </w:r>
-            <w:proofErr w:type="spellStart"/>
-            <w:r>
-              <w:rPr>
-                <w:rFonts w:ascii="Courier New" w:eastAsia="Courier New" w:hAnsi="Courier New" w:cs="Courier New"/>
-                <w:color w:val="1A1A2E"/>
-                <w:sz w:val="18"/>
-                <w:szCs w:val="18"/>
-              </w:rPr>
-              <w:t>ProductKey</w:t>
-            </w:r>
-            <w:proofErr w:type="spellEnd"/>
-            <w:r>
-              <w:rPr>
-                <w:rFonts w:ascii="Courier New" w:eastAsia="Courier New" w:hAnsi="Courier New" w:cs="Courier New"/>
-                <w:color w:val="1A1A2E"/>
-                <w:sz w:val="18"/>
-                <w:szCs w:val="18"/>
-              </w:rPr>
-              <w:t>])</w:t>
+              <w:t xml:space="preserve">    TREATAS(SelectedProducts, Budget[ProductKey])</w:t>
             </w:r>
           </w:p>
         </w:tc>
@@ -10587,47 +10475,7 @@
                 <w:sz w:val="18"/>
                 <w:szCs w:val="18"/>
               </w:rPr>
-              <w:t xml:space="preserve">    CROSSFILTER(Products[</w:t>
-            </w:r>
-            <w:proofErr w:type="spellStart"/>
-            <w:r>
-              <w:rPr>
-                <w:rFonts w:ascii="Courier New" w:eastAsia="Courier New" w:hAnsi="Courier New" w:cs="Courier New"/>
-                <w:color w:val="1A1A2E"/>
-                <w:sz w:val="18"/>
-                <w:szCs w:val="18"/>
-              </w:rPr>
-              <w:t>ProductID</w:t>
-            </w:r>
-            <w:proofErr w:type="spellEnd"/>
-            <w:r>
-              <w:rPr>
-                <w:rFonts w:ascii="Courier New" w:eastAsia="Courier New" w:hAnsi="Courier New" w:cs="Courier New"/>
-                <w:color w:val="1A1A2E"/>
-                <w:sz w:val="18"/>
-                <w:szCs w:val="18"/>
-              </w:rPr>
-              <w:t>], Sales[</w:t>
-            </w:r>
-            <w:proofErr w:type="spellStart"/>
-            <w:r>
-              <w:rPr>
-                <w:rFonts w:ascii="Courier New" w:eastAsia="Courier New" w:hAnsi="Courier New" w:cs="Courier New"/>
-                <w:color w:val="1A1A2E"/>
-                <w:sz w:val="18"/>
-                <w:szCs w:val="18"/>
-              </w:rPr>
-              <w:t>ProductID</w:t>
-            </w:r>
-            <w:proofErr w:type="spellEnd"/>
-            <w:r>
-              <w:rPr>
-                <w:rFonts w:ascii="Courier New" w:eastAsia="Courier New" w:hAnsi="Courier New" w:cs="Courier New"/>
-                <w:color w:val="1A1A2E"/>
-                <w:sz w:val="18"/>
-                <w:szCs w:val="18"/>
-              </w:rPr>
-              <w:t>], None)</w:t>
+              <w:t xml:space="preserve">    CROSSFILTER(Products[ProductID], Sales[ProductID], None)</w:t>
             </w:r>
           </w:p>
         </w:tc>
@@ -10890,47 +10738,7 @@
                 <w:sz w:val="18"/>
                 <w:szCs w:val="18"/>
               </w:rPr>
-              <w:t xml:space="preserve">        VALUES(</w:t>
-            </w:r>
-            <w:proofErr w:type="spellStart"/>
-            <w:r>
-              <w:rPr>
-                <w:rFonts w:ascii="Courier New" w:eastAsia="Courier New" w:hAnsi="Courier New" w:cs="Courier New"/>
-                <w:color w:val="1A1A2E"/>
-                <w:sz w:val="18"/>
-                <w:szCs w:val="18"/>
-              </w:rPr>
-              <w:t>SalesB</w:t>
-            </w:r>
-            <w:proofErr w:type="spellEnd"/>
-            <w:r>
-              <w:rPr>
-                <w:rFonts w:ascii="Courier New" w:eastAsia="Courier New" w:hAnsi="Courier New" w:cs="Courier New"/>
-                <w:color w:val="1A1A2E"/>
-                <w:sz w:val="18"/>
-                <w:szCs w:val="18"/>
-              </w:rPr>
-              <w:t>[</w:t>
-            </w:r>
-            <w:proofErr w:type="spellStart"/>
-            <w:r>
-              <w:rPr>
-                <w:rFonts w:ascii="Courier New" w:eastAsia="Courier New" w:hAnsi="Courier New" w:cs="Courier New"/>
-                <w:color w:val="1A1A2E"/>
-                <w:sz w:val="18"/>
-                <w:szCs w:val="18"/>
-              </w:rPr>
-              <w:t>CustomerID</w:t>
-            </w:r>
-            <w:proofErr w:type="spellEnd"/>
-            <w:r>
-              <w:rPr>
-                <w:rFonts w:ascii="Courier New" w:eastAsia="Courier New" w:hAnsi="Courier New" w:cs="Courier New"/>
-                <w:color w:val="1A1A2E"/>
-                <w:sz w:val="18"/>
-                <w:szCs w:val="18"/>
-              </w:rPr>
-              <w:t>])</w:t>
+              <w:t xml:space="preserve">        VALUES(SalesB[CustomerID])</w:t>
             </w:r>
           </w:p>
         </w:tc>
@@ -11150,135 +10958,75 @@
                 <w:sz w:val="18"/>
                 <w:szCs w:val="18"/>
               </w:rPr>
-              <w:t xml:space="preserve">VAR </w:t>
-            </w:r>
-            <w:proofErr w:type="spellStart"/>
-            <w:r>
-              <w:rPr>
-                <w:rFonts w:ascii="Courier New" w:eastAsia="Courier New" w:hAnsi="Courier New" w:cs="Courier New"/>
-                <w:color w:val="1A1A2E"/>
-                <w:sz w:val="18"/>
-                <w:szCs w:val="18"/>
-              </w:rPr>
-              <w:t>ProductRevenue</w:t>
-            </w:r>
-            <w:proofErr w:type="spellEnd"/>
-            <w:r>
-              <w:rPr>
-                <w:rFonts w:ascii="Courier New" w:eastAsia="Courier New" w:hAnsi="Courier New" w:cs="Courier New"/>
-                <w:color w:val="1A1A2E"/>
-                <w:sz w:val="18"/>
-                <w:szCs w:val="18"/>
-              </w:rPr>
-              <w:t xml:space="preserve">   = [Total Sales]</w:t>
-            </w:r>
-          </w:p>
-        </w:tc>
-      </w:tr>
-      <w:tr>
-        <w:tc>
-          <w:tcPr>
-            <w:tcW w:w="9026" w:type="dxa"/>
-            <w:tcBorders>
-              <w:top w:val="none" w:sz="0" w:space="0" w:color="FFFFFF"/>
-              <w:left w:val="none" w:sz="0" w:space="0" w:color="FFFFFF"/>
-              <w:bottom w:val="none" w:sz="0" w:space="0" w:color="FFFFFF"/>
-              <w:right w:val="none" w:sz="0" w:space="0" w:color="FFFFFF"/>
-            </w:tcBorders>
-            <w:shd w:val="clear" w:color="auto" w:fill="F2F2F2"/>
-            <w:tcMar>
-              <w:top w:w="0" w:type="dxa"/>
-              <w:left w:w="200" w:type="dxa"/>
-              <w:bottom w:w="0" w:type="dxa"/>
-              <w:right w:w="200" w:type="dxa"/>
-            </w:tcMar>
-          </w:tcPr>
-          <w:p>
-            <w:pPr>
-              <w:ind w:left="280"/>
-            </w:pPr>
-            <w:r>
-              <w:rPr>
-                <w:rFonts w:ascii="Courier New" w:eastAsia="Courier New" w:hAnsi="Courier New" w:cs="Courier New"/>
-                <w:color w:val="1A1A2E"/>
-                <w:sz w:val="18"/>
-                <w:szCs w:val="18"/>
-              </w:rPr>
-              <w:t xml:space="preserve">VAR </w:t>
-            </w:r>
-            <w:proofErr w:type="spellStart"/>
-            <w:r>
-              <w:rPr>
-                <w:rFonts w:ascii="Courier New" w:eastAsia="Courier New" w:hAnsi="Courier New" w:cs="Courier New"/>
-                <w:color w:val="1A1A2E"/>
-                <w:sz w:val="18"/>
-                <w:szCs w:val="18"/>
-              </w:rPr>
-              <w:t>TotalRevenue</w:t>
-            </w:r>
-            <w:proofErr w:type="spellEnd"/>
-            <w:r>
-              <w:rPr>
-                <w:rFonts w:ascii="Courier New" w:eastAsia="Courier New" w:hAnsi="Courier New" w:cs="Courier New"/>
-                <w:color w:val="1A1A2E"/>
-                <w:sz w:val="18"/>
-                <w:szCs w:val="18"/>
-              </w:rPr>
-              <w:t xml:space="preserve">     = CALCULATE([Total Sales], ALL(Products))</w:t>
-            </w:r>
-          </w:p>
-        </w:tc>
-      </w:tr>
-      <w:tr>
-        <w:tc>
-          <w:tcPr>
-            <w:tcW w:w="9026" w:type="dxa"/>
-            <w:tcBorders>
-              <w:top w:val="none" w:sz="0" w:space="0" w:color="FFFFFF"/>
-              <w:left w:val="none" w:sz="0" w:space="0" w:color="FFFFFF"/>
-              <w:bottom w:val="none" w:sz="0" w:space="0" w:color="FFFFFF"/>
-              <w:right w:val="none" w:sz="0" w:space="0" w:color="FFFFFF"/>
-            </w:tcBorders>
-            <w:shd w:val="clear" w:color="auto" w:fill="F2F2F2"/>
-            <w:tcMar>
-              <w:top w:w="0" w:type="dxa"/>
-              <w:left w:w="200" w:type="dxa"/>
-              <w:bottom w:w="0" w:type="dxa"/>
-              <w:right w:w="200" w:type="dxa"/>
-            </w:tcMar>
-          </w:tcPr>
-          <w:p>
-            <w:pPr>
-              <w:ind w:left="280"/>
-            </w:pPr>
-            <w:r>
-              <w:rPr>
-                <w:rFonts w:ascii="Courier New" w:eastAsia="Courier New" w:hAnsi="Courier New" w:cs="Courier New"/>
-                <w:color w:val="1A1A2E"/>
-                <w:sz w:val="18"/>
-                <w:szCs w:val="18"/>
-              </w:rPr>
-              <w:t xml:space="preserve">VAR </w:t>
-            </w:r>
-            <w:proofErr w:type="spellStart"/>
-            <w:r>
-              <w:rPr>
-                <w:rFonts w:ascii="Courier New" w:eastAsia="Courier New" w:hAnsi="Courier New" w:cs="Courier New"/>
-                <w:color w:val="1A1A2E"/>
-                <w:sz w:val="18"/>
-                <w:szCs w:val="18"/>
-              </w:rPr>
-              <w:t>CumulativeRevenue</w:t>
-            </w:r>
-            <w:proofErr w:type="spellEnd"/>
-            <w:r>
-              <w:rPr>
-                <w:rFonts w:ascii="Courier New" w:eastAsia="Courier New" w:hAnsi="Courier New" w:cs="Courier New"/>
-                <w:color w:val="1A1A2E"/>
-                <w:sz w:val="18"/>
-                <w:szCs w:val="18"/>
-              </w:rPr>
-              <w:t>=</w:t>
+              <w:t>VAR ProductRevenue   = [Total Sales]</w:t>
+            </w:r>
+          </w:p>
+        </w:tc>
+      </w:tr>
+      <w:tr>
+        <w:tc>
+          <w:tcPr>
+            <w:tcW w:w="9026" w:type="dxa"/>
+            <w:tcBorders>
+              <w:top w:val="none" w:sz="0" w:space="0" w:color="FFFFFF"/>
+              <w:left w:val="none" w:sz="0" w:space="0" w:color="FFFFFF"/>
+              <w:bottom w:val="none" w:sz="0" w:space="0" w:color="FFFFFF"/>
+              <w:right w:val="none" w:sz="0" w:space="0" w:color="FFFFFF"/>
+            </w:tcBorders>
+            <w:shd w:val="clear" w:color="auto" w:fill="F2F2F2"/>
+            <w:tcMar>
+              <w:top w:w="0" w:type="dxa"/>
+              <w:left w:w="200" w:type="dxa"/>
+              <w:bottom w:w="0" w:type="dxa"/>
+              <w:right w:w="200" w:type="dxa"/>
+            </w:tcMar>
+          </w:tcPr>
+          <w:p>
+            <w:pPr>
+              <w:ind w:left="280"/>
+            </w:pPr>
+            <w:r>
+              <w:rPr>
+                <w:rFonts w:ascii="Courier New" w:eastAsia="Courier New" w:hAnsi="Courier New" w:cs="Courier New"/>
+                <w:color w:val="1A1A2E"/>
+                <w:sz w:val="18"/>
+                <w:szCs w:val="18"/>
+              </w:rPr>
+              <w:t>VAR TotalRevenue     = CALCULATE([Total Sales], ALL(Products))</w:t>
+            </w:r>
+          </w:p>
+        </w:tc>
+      </w:tr>
+      <w:tr>
+        <w:tc>
+          <w:tcPr>
+            <w:tcW w:w="9026" w:type="dxa"/>
+            <w:tcBorders>
+              <w:top w:val="none" w:sz="0" w:space="0" w:color="FFFFFF"/>
+              <w:left w:val="none" w:sz="0" w:space="0" w:color="FFFFFF"/>
+              <w:bottom w:val="none" w:sz="0" w:space="0" w:color="FFFFFF"/>
+              <w:right w:val="none" w:sz="0" w:space="0" w:color="FFFFFF"/>
+            </w:tcBorders>
+            <w:shd w:val="clear" w:color="auto" w:fill="F2F2F2"/>
+            <w:tcMar>
+              <w:top w:w="0" w:type="dxa"/>
+              <w:left w:w="200" w:type="dxa"/>
+              <w:bottom w:w="0" w:type="dxa"/>
+              <w:right w:w="200" w:type="dxa"/>
+            </w:tcMar>
+          </w:tcPr>
+          <w:p>
+            <w:pPr>
+              <w:ind w:left="280"/>
+            </w:pPr>
+            <w:r>
+              <w:rPr>
+                <w:rFonts w:ascii="Courier New" w:eastAsia="Courier New" w:hAnsi="Courier New" w:cs="Courier New"/>
+                <w:color w:val="1A1A2E"/>
+                <w:sz w:val="18"/>
+                <w:szCs w:val="18"/>
+              </w:rPr>
+              <w:t>VAR CumulativeRevenue=</w:t>
             </w:r>
           </w:p>
         </w:tc>
@@ -11448,19 +11196,8 @@
                 <w:sz w:val="18"/>
                 <w:szCs w:val="18"/>
               </w:rPr>
-              <w:t xml:space="preserve">            [Total Sales] &gt;= </w:t>
-            </w:r>
-            <w:proofErr w:type="spellStart"/>
-            <w:r>
-              <w:rPr>
-                <w:rFonts w:ascii="Courier New" w:eastAsia="Courier New" w:hAnsi="Courier New" w:cs="Courier New"/>
-                <w:color w:val="1A1A2E"/>
-                <w:sz w:val="18"/>
-                <w:szCs w:val="18"/>
-              </w:rPr>
-              <w:t>ProductRevenue</w:t>
-            </w:r>
-            <w:proofErr w:type="spellEnd"/>
+              <w:t xml:space="preserve">            [Total Sales] &gt;= ProductRevenue</w:t>
+            </w:r>
           </w:p>
         </w:tc>
       </w:tr>
@@ -11561,59 +11298,237 @@
                 <w:sz w:val="18"/>
                 <w:szCs w:val="18"/>
               </w:rPr>
-              <w:t xml:space="preserve">VAR </w:t>
-            </w:r>
-            <w:proofErr w:type="spellStart"/>
-            <w:r>
-              <w:rPr>
-                <w:rFonts w:ascii="Courier New" w:eastAsia="Courier New" w:hAnsi="Courier New" w:cs="Courier New"/>
-                <w:color w:val="1A1A2E"/>
-                <w:sz w:val="18"/>
-                <w:szCs w:val="18"/>
-              </w:rPr>
-              <w:t>CumulativePct</w:t>
-            </w:r>
-            <w:proofErr w:type="spellEnd"/>
-            <w:r>
-              <w:rPr>
-                <w:rFonts w:ascii="Courier New" w:eastAsia="Courier New" w:hAnsi="Courier New" w:cs="Courier New"/>
-                <w:color w:val="1A1A2E"/>
-                <w:sz w:val="18"/>
-                <w:szCs w:val="18"/>
-              </w:rPr>
-              <w:t xml:space="preserve"> = DIVIDE(</w:t>
-            </w:r>
-            <w:proofErr w:type="spellStart"/>
-            <w:r>
-              <w:rPr>
-                <w:rFonts w:ascii="Courier New" w:eastAsia="Courier New" w:hAnsi="Courier New" w:cs="Courier New"/>
-                <w:color w:val="1A1A2E"/>
-                <w:sz w:val="18"/>
-                <w:szCs w:val="18"/>
-              </w:rPr>
-              <w:t>CumulativeRevenue</w:t>
-            </w:r>
-            <w:proofErr w:type="spellEnd"/>
-            <w:r>
-              <w:rPr>
-                <w:rFonts w:ascii="Courier New" w:eastAsia="Courier New" w:hAnsi="Courier New" w:cs="Courier New"/>
-                <w:color w:val="1A1A2E"/>
-                <w:sz w:val="18"/>
-                <w:szCs w:val="18"/>
-              </w:rPr>
-              <w:t xml:space="preserve">, </w:t>
-            </w:r>
-            <w:proofErr w:type="spellStart"/>
-            <w:r>
-              <w:rPr>
-                <w:rFonts w:ascii="Courier New" w:eastAsia="Courier New" w:hAnsi="Courier New" w:cs="Courier New"/>
-                <w:color w:val="1A1A2E"/>
-                <w:sz w:val="18"/>
-                <w:szCs w:val="18"/>
-              </w:rPr>
-              <w:t>TotalRevenue</w:t>
-            </w:r>
-            <w:proofErr w:type="spellEnd"/>
+              <w:t>VAR CumulativePct = DIVIDE(CumulativeRevenue, TotalRevenue)</w:t>
+            </w:r>
+          </w:p>
+        </w:tc>
+      </w:tr>
+      <w:tr>
+        <w:tc>
+          <w:tcPr>
+            <w:tcW w:w="9026" w:type="dxa"/>
+            <w:tcBorders>
+              <w:top w:val="none" w:sz="0" w:space="0" w:color="FFFFFF"/>
+              <w:left w:val="none" w:sz="0" w:space="0" w:color="FFFFFF"/>
+              <w:bottom w:val="none" w:sz="0" w:space="0" w:color="FFFFFF"/>
+              <w:right w:val="none" w:sz="0" w:space="0" w:color="FFFFFF"/>
+            </w:tcBorders>
+            <w:shd w:val="clear" w:color="auto" w:fill="F2F2F2"/>
+            <w:tcMar>
+              <w:top w:w="0" w:type="dxa"/>
+              <w:left w:w="200" w:type="dxa"/>
+              <w:bottom w:w="0" w:type="dxa"/>
+              <w:right w:w="200" w:type="dxa"/>
+            </w:tcMar>
+          </w:tcPr>
+          <w:p>
+            <w:pPr>
+              <w:ind w:left="280"/>
+            </w:pPr>
+            <w:r>
+              <w:rPr>
+                <w:rFonts w:ascii="Courier New" w:eastAsia="Courier New" w:hAnsi="Courier New" w:cs="Courier New"/>
+                <w:color w:val="1A1A2E"/>
+                <w:sz w:val="18"/>
+                <w:szCs w:val="18"/>
+              </w:rPr>
+              <w:t>RETURN</w:t>
+            </w:r>
+          </w:p>
+        </w:tc>
+      </w:tr>
+      <w:tr>
+        <w:tc>
+          <w:tcPr>
+            <w:tcW w:w="9026" w:type="dxa"/>
+            <w:tcBorders>
+              <w:top w:val="none" w:sz="0" w:space="0" w:color="FFFFFF"/>
+              <w:left w:val="none" w:sz="0" w:space="0" w:color="FFFFFF"/>
+              <w:bottom w:val="none" w:sz="0" w:space="0" w:color="FFFFFF"/>
+              <w:right w:val="none" w:sz="0" w:space="0" w:color="FFFFFF"/>
+            </w:tcBorders>
+            <w:shd w:val="clear" w:color="auto" w:fill="F2F2F2"/>
+            <w:tcMar>
+              <w:top w:w="0" w:type="dxa"/>
+              <w:left w:w="200" w:type="dxa"/>
+              <w:bottom w:w="0" w:type="dxa"/>
+              <w:right w:w="200" w:type="dxa"/>
+            </w:tcMar>
+          </w:tcPr>
+          <w:p>
+            <w:pPr>
+              <w:ind w:left="280"/>
+            </w:pPr>
+            <w:r>
+              <w:rPr>
+                <w:rFonts w:ascii="Courier New" w:eastAsia="Courier New" w:hAnsi="Courier New" w:cs="Courier New"/>
+                <w:color w:val="1A1A2E"/>
+                <w:sz w:val="18"/>
+                <w:szCs w:val="18"/>
+              </w:rPr>
+              <w:t>SWITCH(</w:t>
+            </w:r>
+          </w:p>
+        </w:tc>
+      </w:tr>
+      <w:tr>
+        <w:tc>
+          <w:tcPr>
+            <w:tcW w:w="9026" w:type="dxa"/>
+            <w:tcBorders>
+              <w:top w:val="none" w:sz="0" w:space="0" w:color="FFFFFF"/>
+              <w:left w:val="none" w:sz="0" w:space="0" w:color="FFFFFF"/>
+              <w:bottom w:val="none" w:sz="0" w:space="0" w:color="FFFFFF"/>
+              <w:right w:val="none" w:sz="0" w:space="0" w:color="FFFFFF"/>
+            </w:tcBorders>
+            <w:shd w:val="clear" w:color="auto" w:fill="F2F2F2"/>
+            <w:tcMar>
+              <w:top w:w="0" w:type="dxa"/>
+              <w:left w:w="200" w:type="dxa"/>
+              <w:bottom w:w="0" w:type="dxa"/>
+              <w:right w:w="200" w:type="dxa"/>
+            </w:tcMar>
+          </w:tcPr>
+          <w:p>
+            <w:pPr>
+              <w:ind w:left="280"/>
+            </w:pPr>
+            <w:r>
+              <w:rPr>
+                <w:rFonts w:ascii="Courier New" w:eastAsia="Courier New" w:hAnsi="Courier New" w:cs="Courier New"/>
+                <w:color w:val="1A1A2E"/>
+                <w:sz w:val="18"/>
+                <w:szCs w:val="18"/>
+              </w:rPr>
+              <w:t xml:space="preserve">    TRUE(),</w:t>
+            </w:r>
+          </w:p>
+        </w:tc>
+      </w:tr>
+      <w:tr>
+        <w:tc>
+          <w:tcPr>
+            <w:tcW w:w="9026" w:type="dxa"/>
+            <w:tcBorders>
+              <w:top w:val="none" w:sz="0" w:space="0" w:color="FFFFFF"/>
+              <w:left w:val="none" w:sz="0" w:space="0" w:color="FFFFFF"/>
+              <w:bottom w:val="none" w:sz="0" w:space="0" w:color="FFFFFF"/>
+              <w:right w:val="none" w:sz="0" w:space="0" w:color="FFFFFF"/>
+            </w:tcBorders>
+            <w:shd w:val="clear" w:color="auto" w:fill="F2F2F2"/>
+            <w:tcMar>
+              <w:top w:w="0" w:type="dxa"/>
+              <w:left w:w="200" w:type="dxa"/>
+              <w:bottom w:w="0" w:type="dxa"/>
+              <w:right w:w="200" w:type="dxa"/>
+            </w:tcMar>
+          </w:tcPr>
+          <w:p>
+            <w:pPr>
+              <w:ind w:left="280"/>
+            </w:pPr>
+            <w:r>
+              <w:rPr>
+                <w:rFonts w:ascii="Courier New" w:eastAsia="Courier New" w:hAnsi="Courier New" w:cs="Courier New"/>
+                <w:color w:val="1A1A2E"/>
+                <w:sz w:val="18"/>
+                <w:szCs w:val="18"/>
+              </w:rPr>
+              <w:t xml:space="preserve">    CumulativePct &lt;= 0.80, "A - Top 80%",</w:t>
+            </w:r>
+          </w:p>
+        </w:tc>
+      </w:tr>
+      <w:tr>
+        <w:tc>
+          <w:tcPr>
+            <w:tcW w:w="9026" w:type="dxa"/>
+            <w:tcBorders>
+              <w:top w:val="none" w:sz="0" w:space="0" w:color="FFFFFF"/>
+              <w:left w:val="none" w:sz="0" w:space="0" w:color="FFFFFF"/>
+              <w:bottom w:val="none" w:sz="0" w:space="0" w:color="FFFFFF"/>
+              <w:right w:val="none" w:sz="0" w:space="0" w:color="FFFFFF"/>
+            </w:tcBorders>
+            <w:shd w:val="clear" w:color="auto" w:fill="F2F2F2"/>
+            <w:tcMar>
+              <w:top w:w="0" w:type="dxa"/>
+              <w:left w:w="200" w:type="dxa"/>
+              <w:bottom w:w="0" w:type="dxa"/>
+              <w:right w:w="200" w:type="dxa"/>
+            </w:tcMar>
+          </w:tcPr>
+          <w:p>
+            <w:pPr>
+              <w:ind w:left="280"/>
+            </w:pPr>
+            <w:r>
+              <w:rPr>
+                <w:rFonts w:ascii="Courier New" w:eastAsia="Courier New" w:hAnsi="Courier New" w:cs="Courier New"/>
+                <w:color w:val="1A1A2E"/>
+                <w:sz w:val="18"/>
+                <w:szCs w:val="18"/>
+              </w:rPr>
+              <w:t xml:space="preserve">    CumulativePct &lt;= 0.95, "B - Next 15%",</w:t>
+            </w:r>
+          </w:p>
+        </w:tc>
+      </w:tr>
+      <w:tr>
+        <w:tc>
+          <w:tcPr>
+            <w:tcW w:w="9026" w:type="dxa"/>
+            <w:tcBorders>
+              <w:top w:val="none" w:sz="0" w:space="0" w:color="FFFFFF"/>
+              <w:left w:val="none" w:sz="0" w:space="0" w:color="FFFFFF"/>
+              <w:bottom w:val="none" w:sz="0" w:space="0" w:color="FFFFFF"/>
+              <w:right w:val="none" w:sz="0" w:space="0" w:color="FFFFFF"/>
+            </w:tcBorders>
+            <w:shd w:val="clear" w:color="auto" w:fill="F2F2F2"/>
+            <w:tcMar>
+              <w:top w:w="0" w:type="dxa"/>
+              <w:left w:w="200" w:type="dxa"/>
+              <w:bottom w:w="0" w:type="dxa"/>
+              <w:right w:w="200" w:type="dxa"/>
+            </w:tcMar>
+          </w:tcPr>
+          <w:p>
+            <w:pPr>
+              <w:ind w:left="280"/>
+            </w:pPr>
+            <w:r>
+              <w:rPr>
+                <w:rFonts w:ascii="Courier New" w:eastAsia="Courier New" w:hAnsi="Courier New" w:cs="Courier New"/>
+                <w:color w:val="1A1A2E"/>
+                <w:sz w:val="18"/>
+                <w:szCs w:val="18"/>
+              </w:rPr>
+              <w:t xml:space="preserve">    "C - Bottom 5%"</w:t>
+            </w:r>
+          </w:p>
+        </w:tc>
+      </w:tr>
+      <w:tr>
+        <w:tc>
+          <w:tcPr>
+            <w:tcW w:w="9026" w:type="dxa"/>
+            <w:tcBorders>
+              <w:top w:val="none" w:sz="0" w:space="0" w:color="FFFFFF"/>
+              <w:left w:val="none" w:sz="0" w:space="0" w:color="FFFFFF"/>
+              <w:bottom w:val="none" w:sz="0" w:space="0" w:color="FFFFFF"/>
+              <w:right w:val="none" w:sz="0" w:space="0" w:color="FFFFFF"/>
+            </w:tcBorders>
+            <w:shd w:val="clear" w:color="auto" w:fill="F2F2F2"/>
+            <w:tcMar>
+              <w:top w:w="0" w:type="dxa"/>
+              <w:left w:w="200" w:type="dxa"/>
+              <w:bottom w:w="0" w:type="dxa"/>
+              <w:right w:w="200" w:type="dxa"/>
+            </w:tcMar>
+          </w:tcPr>
+          <w:p>
+            <w:pPr>
+              <w:ind w:left="280"/>
+            </w:pPr>
             <w:r>
               <w:rPr>
                 <w:rFonts w:ascii="Courier New" w:eastAsia="Courier New" w:hAnsi="Courier New" w:cs="Courier New"/>
@@ -11648,6 +11563,167 @@
             <w:pPr>
               <w:ind w:left="280"/>
             </w:pPr>
+          </w:p>
+        </w:tc>
+      </w:tr>
+      <w:tr>
+        <w:tc>
+          <w:tcPr>
+            <w:tcW w:w="9026" w:type="dxa"/>
+            <w:tcBorders>
+              <w:top w:val="none" w:sz="0" w:space="0" w:color="FFFFFF"/>
+              <w:left w:val="none" w:sz="0" w:space="0" w:color="FFFFFF"/>
+              <w:bottom w:val="none" w:sz="0" w:space="0" w:color="FFFFFF"/>
+              <w:right w:val="none" w:sz="0" w:space="0" w:color="FFFFFF"/>
+            </w:tcBorders>
+            <w:shd w:val="clear" w:color="auto" w:fill="F2F2F2"/>
+            <w:tcMar>
+              <w:top w:w="0" w:type="dxa"/>
+              <w:left w:w="200" w:type="dxa"/>
+              <w:bottom w:w="0" w:type="dxa"/>
+              <w:right w:w="200" w:type="dxa"/>
+            </w:tcMar>
+          </w:tcPr>
+          <w:p>
+            <w:pPr>
+              <w:ind w:left="280"/>
+            </w:pPr>
+            <w:r>
+              <w:rPr>
+                <w:rFonts w:ascii="Courier New" w:eastAsia="Courier New" w:hAnsi="Courier New" w:cs="Courier New"/>
+                <w:color w:val="1A1A2E"/>
+                <w:sz w:val="18"/>
+                <w:szCs w:val="18"/>
+              </w:rPr>
+              <w:t>// RFM Segmentation — Recency, Frequency, Monetary</w:t>
+            </w:r>
+          </w:p>
+        </w:tc>
+      </w:tr>
+      <w:tr>
+        <w:tc>
+          <w:tcPr>
+            <w:tcW w:w="9026" w:type="dxa"/>
+            <w:tcBorders>
+              <w:top w:val="none" w:sz="0" w:space="0" w:color="FFFFFF"/>
+              <w:left w:val="none" w:sz="0" w:space="0" w:color="FFFFFF"/>
+              <w:bottom w:val="none" w:sz="0" w:space="0" w:color="FFFFFF"/>
+              <w:right w:val="none" w:sz="0" w:space="0" w:color="FFFFFF"/>
+            </w:tcBorders>
+            <w:shd w:val="clear" w:color="auto" w:fill="F2F2F2"/>
+            <w:tcMar>
+              <w:top w:w="0" w:type="dxa"/>
+              <w:left w:w="200" w:type="dxa"/>
+              <w:bottom w:w="0" w:type="dxa"/>
+              <w:right w:w="200" w:type="dxa"/>
+            </w:tcMar>
+          </w:tcPr>
+          <w:p>
+            <w:pPr>
+              <w:ind w:left="280"/>
+            </w:pPr>
+            <w:r>
+              <w:rPr>
+                <w:rFonts w:ascii="Courier New" w:eastAsia="Courier New" w:hAnsi="Courier New" w:cs="Courier New"/>
+                <w:color w:val="1A1A2E"/>
+                <w:sz w:val="18"/>
+                <w:szCs w:val="18"/>
+              </w:rPr>
+              <w:t>Recency Score =</w:t>
+            </w:r>
+          </w:p>
+        </w:tc>
+      </w:tr>
+      <w:tr>
+        <w:tc>
+          <w:tcPr>
+            <w:tcW w:w="9026" w:type="dxa"/>
+            <w:tcBorders>
+              <w:top w:val="none" w:sz="0" w:space="0" w:color="FFFFFF"/>
+              <w:left w:val="none" w:sz="0" w:space="0" w:color="FFFFFF"/>
+              <w:bottom w:val="none" w:sz="0" w:space="0" w:color="FFFFFF"/>
+              <w:right w:val="none" w:sz="0" w:space="0" w:color="FFFFFF"/>
+            </w:tcBorders>
+            <w:shd w:val="clear" w:color="auto" w:fill="F2F2F2"/>
+            <w:tcMar>
+              <w:top w:w="0" w:type="dxa"/>
+              <w:left w:w="200" w:type="dxa"/>
+              <w:bottom w:w="0" w:type="dxa"/>
+              <w:right w:w="200" w:type="dxa"/>
+            </w:tcMar>
+          </w:tcPr>
+          <w:p>
+            <w:pPr>
+              <w:ind w:left="280"/>
+            </w:pPr>
+            <w:r>
+              <w:rPr>
+                <w:rFonts w:ascii="Courier New" w:eastAsia="Courier New" w:hAnsi="Courier New" w:cs="Courier New"/>
+                <w:color w:val="1A1A2E"/>
+                <w:sz w:val="18"/>
+                <w:szCs w:val="18"/>
+              </w:rPr>
+              <w:t>VAR LastPurchase = CALCULATE(MAX(Sales[OrderDate]), ALLEXCEPT(Customers, Customers[CustomerID]))</w:t>
+            </w:r>
+          </w:p>
+        </w:tc>
+      </w:tr>
+      <w:tr>
+        <w:tc>
+          <w:tcPr>
+            <w:tcW w:w="9026" w:type="dxa"/>
+            <w:tcBorders>
+              <w:top w:val="none" w:sz="0" w:space="0" w:color="FFFFFF"/>
+              <w:left w:val="none" w:sz="0" w:space="0" w:color="FFFFFF"/>
+              <w:bottom w:val="none" w:sz="0" w:space="0" w:color="FFFFFF"/>
+              <w:right w:val="none" w:sz="0" w:space="0" w:color="FFFFFF"/>
+            </w:tcBorders>
+            <w:shd w:val="clear" w:color="auto" w:fill="F2F2F2"/>
+            <w:tcMar>
+              <w:top w:w="0" w:type="dxa"/>
+              <w:left w:w="200" w:type="dxa"/>
+              <w:bottom w:w="0" w:type="dxa"/>
+              <w:right w:w="200" w:type="dxa"/>
+            </w:tcMar>
+          </w:tcPr>
+          <w:p>
+            <w:pPr>
+              <w:ind w:left="280"/>
+            </w:pPr>
+            <w:r>
+              <w:rPr>
+                <w:rFonts w:ascii="Courier New" w:eastAsia="Courier New" w:hAnsi="Courier New" w:cs="Courier New"/>
+                <w:color w:val="1A1A2E"/>
+                <w:sz w:val="18"/>
+                <w:szCs w:val="18"/>
+              </w:rPr>
+              <w:t>VAR DaysSince    = DATEDIFF(LastPurchase, TODAY(), DAY)</w:t>
+            </w:r>
+          </w:p>
+        </w:tc>
+      </w:tr>
+      <w:tr>
+        <w:tc>
+          <w:tcPr>
+            <w:tcW w:w="9026" w:type="dxa"/>
+            <w:tcBorders>
+              <w:top w:val="none" w:sz="0" w:space="0" w:color="FFFFFF"/>
+              <w:left w:val="none" w:sz="0" w:space="0" w:color="FFFFFF"/>
+              <w:bottom w:val="none" w:sz="0" w:space="0" w:color="FFFFFF"/>
+              <w:right w:val="none" w:sz="0" w:space="0" w:color="FFFFFF"/>
+            </w:tcBorders>
+            <w:shd w:val="clear" w:color="auto" w:fill="F2F2F2"/>
+            <w:tcMar>
+              <w:top w:w="0" w:type="dxa"/>
+              <w:left w:w="200" w:type="dxa"/>
+              <w:bottom w:w="0" w:type="dxa"/>
+              <w:right w:w="200" w:type="dxa"/>
+            </w:tcMar>
+          </w:tcPr>
+          <w:p>
+            <w:pPr>
+              <w:ind w:left="280"/>
+            </w:pPr>
             <w:r>
               <w:rPr>
                 <w:rFonts w:ascii="Courier New" w:eastAsia="Courier New" w:hAnsi="Courier New" w:cs="Courier New"/>
@@ -11757,115 +11833,143 @@
                 <w:sz w:val="18"/>
                 <w:szCs w:val="18"/>
               </w:rPr>
-              <w:t xml:space="preserve">    </w:t>
-            </w:r>
-            <w:proofErr w:type="spellStart"/>
-            <w:r>
-              <w:rPr>
-                <w:rFonts w:ascii="Courier New" w:eastAsia="Courier New" w:hAnsi="Courier New" w:cs="Courier New"/>
-                <w:color w:val="1A1A2E"/>
-                <w:sz w:val="18"/>
-                <w:szCs w:val="18"/>
-              </w:rPr>
-              <w:t>CumulativePct</w:t>
-            </w:r>
-            <w:proofErr w:type="spellEnd"/>
-            <w:r>
-              <w:rPr>
-                <w:rFonts w:ascii="Courier New" w:eastAsia="Courier New" w:hAnsi="Courier New" w:cs="Courier New"/>
-                <w:color w:val="1A1A2E"/>
-                <w:sz w:val="18"/>
-                <w:szCs w:val="18"/>
-              </w:rPr>
-              <w:t xml:space="preserve"> &lt;= 0.80, "A - Top 80%",</w:t>
-            </w:r>
-          </w:p>
-        </w:tc>
-      </w:tr>
-      <w:tr>
-        <w:tc>
-          <w:tcPr>
-            <w:tcW w:w="9026" w:type="dxa"/>
-            <w:tcBorders>
-              <w:top w:val="none" w:sz="0" w:space="0" w:color="FFFFFF"/>
-              <w:left w:val="none" w:sz="0" w:space="0" w:color="FFFFFF"/>
-              <w:bottom w:val="none" w:sz="0" w:space="0" w:color="FFFFFF"/>
-              <w:right w:val="none" w:sz="0" w:space="0" w:color="FFFFFF"/>
-            </w:tcBorders>
-            <w:shd w:val="clear" w:color="auto" w:fill="F2F2F2"/>
-            <w:tcMar>
-              <w:top w:w="0" w:type="dxa"/>
-              <w:left w:w="200" w:type="dxa"/>
-              <w:bottom w:w="0" w:type="dxa"/>
-              <w:right w:w="200" w:type="dxa"/>
-            </w:tcMar>
-          </w:tcPr>
-          <w:p>
-            <w:pPr>
-              <w:ind w:left="280"/>
-            </w:pPr>
-            <w:r>
-              <w:rPr>
-                <w:rFonts w:ascii="Courier New" w:eastAsia="Courier New" w:hAnsi="Courier New" w:cs="Courier New"/>
-                <w:color w:val="1A1A2E"/>
-                <w:sz w:val="18"/>
-                <w:szCs w:val="18"/>
-              </w:rPr>
-              <w:t xml:space="preserve">    </w:t>
-            </w:r>
-            <w:proofErr w:type="spellStart"/>
-            <w:r>
-              <w:rPr>
-                <w:rFonts w:ascii="Courier New" w:eastAsia="Courier New" w:hAnsi="Courier New" w:cs="Courier New"/>
-                <w:color w:val="1A1A2E"/>
-                <w:sz w:val="18"/>
-                <w:szCs w:val="18"/>
-              </w:rPr>
-              <w:t>CumulativePct</w:t>
-            </w:r>
-            <w:proofErr w:type="spellEnd"/>
-            <w:r>
-              <w:rPr>
-                <w:rFonts w:ascii="Courier New" w:eastAsia="Courier New" w:hAnsi="Courier New" w:cs="Courier New"/>
-                <w:color w:val="1A1A2E"/>
-                <w:sz w:val="18"/>
-                <w:szCs w:val="18"/>
-              </w:rPr>
-              <w:t xml:space="preserve"> &lt;= 0.95, "B - Next 15%",</w:t>
-            </w:r>
-          </w:p>
-        </w:tc>
-      </w:tr>
-      <w:tr>
-        <w:tc>
-          <w:tcPr>
-            <w:tcW w:w="9026" w:type="dxa"/>
-            <w:tcBorders>
-              <w:top w:val="none" w:sz="0" w:space="0" w:color="FFFFFF"/>
-              <w:left w:val="none" w:sz="0" w:space="0" w:color="FFFFFF"/>
-              <w:bottom w:val="none" w:sz="0" w:space="0" w:color="FFFFFF"/>
-              <w:right w:val="none" w:sz="0" w:space="0" w:color="FFFFFF"/>
-            </w:tcBorders>
-            <w:shd w:val="clear" w:color="auto" w:fill="F2F2F2"/>
-            <w:tcMar>
-              <w:top w:w="0" w:type="dxa"/>
-              <w:left w:w="200" w:type="dxa"/>
-              <w:bottom w:w="0" w:type="dxa"/>
-              <w:right w:w="200" w:type="dxa"/>
-            </w:tcMar>
-          </w:tcPr>
-          <w:p>
-            <w:pPr>
-              <w:ind w:left="280"/>
-            </w:pPr>
-            <w:r>
-              <w:rPr>
-                <w:rFonts w:ascii="Courier New" w:eastAsia="Courier New" w:hAnsi="Courier New" w:cs="Courier New"/>
-                <w:color w:val="1A1A2E"/>
-                <w:sz w:val="18"/>
-                <w:szCs w:val="18"/>
-              </w:rPr>
-              <w:t xml:space="preserve">    "C - Bottom 5%"</w:t>
+              <w:t xml:space="preserve">    DaysSince &lt;= 30,   5,</w:t>
+            </w:r>
+          </w:p>
+        </w:tc>
+      </w:tr>
+      <w:tr>
+        <w:tc>
+          <w:tcPr>
+            <w:tcW w:w="9026" w:type="dxa"/>
+            <w:tcBorders>
+              <w:top w:val="none" w:sz="0" w:space="0" w:color="FFFFFF"/>
+              <w:left w:val="none" w:sz="0" w:space="0" w:color="FFFFFF"/>
+              <w:bottom w:val="none" w:sz="0" w:space="0" w:color="FFFFFF"/>
+              <w:right w:val="none" w:sz="0" w:space="0" w:color="FFFFFF"/>
+            </w:tcBorders>
+            <w:shd w:val="clear" w:color="auto" w:fill="F2F2F2"/>
+            <w:tcMar>
+              <w:top w:w="0" w:type="dxa"/>
+              <w:left w:w="200" w:type="dxa"/>
+              <w:bottom w:w="0" w:type="dxa"/>
+              <w:right w:w="200" w:type="dxa"/>
+            </w:tcMar>
+          </w:tcPr>
+          <w:p>
+            <w:pPr>
+              <w:ind w:left="280"/>
+            </w:pPr>
+            <w:r>
+              <w:rPr>
+                <w:rFonts w:ascii="Courier New" w:eastAsia="Courier New" w:hAnsi="Courier New" w:cs="Courier New"/>
+                <w:color w:val="1A1A2E"/>
+                <w:sz w:val="18"/>
+                <w:szCs w:val="18"/>
+              </w:rPr>
+              <w:t xml:space="preserve">    DaysSince &lt;= 60,   4,</w:t>
+            </w:r>
+          </w:p>
+        </w:tc>
+      </w:tr>
+      <w:tr>
+        <w:tc>
+          <w:tcPr>
+            <w:tcW w:w="9026" w:type="dxa"/>
+            <w:tcBorders>
+              <w:top w:val="none" w:sz="0" w:space="0" w:color="FFFFFF"/>
+              <w:left w:val="none" w:sz="0" w:space="0" w:color="FFFFFF"/>
+              <w:bottom w:val="none" w:sz="0" w:space="0" w:color="FFFFFF"/>
+              <w:right w:val="none" w:sz="0" w:space="0" w:color="FFFFFF"/>
+            </w:tcBorders>
+            <w:shd w:val="clear" w:color="auto" w:fill="F2F2F2"/>
+            <w:tcMar>
+              <w:top w:w="0" w:type="dxa"/>
+              <w:left w:w="200" w:type="dxa"/>
+              <w:bottom w:w="0" w:type="dxa"/>
+              <w:right w:w="200" w:type="dxa"/>
+            </w:tcMar>
+          </w:tcPr>
+          <w:p>
+            <w:pPr>
+              <w:ind w:left="280"/>
+            </w:pPr>
+            <w:r>
+              <w:rPr>
+                <w:rFonts w:ascii="Courier New" w:eastAsia="Courier New" w:hAnsi="Courier New" w:cs="Courier New"/>
+                <w:color w:val="1A1A2E"/>
+                <w:sz w:val="18"/>
+                <w:szCs w:val="18"/>
+              </w:rPr>
+              <w:t xml:space="preserve">    DaysSince &lt;= 90,   3,</w:t>
+            </w:r>
+          </w:p>
+        </w:tc>
+      </w:tr>
+      <w:tr>
+        <w:tc>
+          <w:tcPr>
+            <w:tcW w:w="9026" w:type="dxa"/>
+            <w:tcBorders>
+              <w:top w:val="none" w:sz="0" w:space="0" w:color="FFFFFF"/>
+              <w:left w:val="none" w:sz="0" w:space="0" w:color="FFFFFF"/>
+              <w:bottom w:val="none" w:sz="0" w:space="0" w:color="FFFFFF"/>
+              <w:right w:val="none" w:sz="0" w:space="0" w:color="FFFFFF"/>
+            </w:tcBorders>
+            <w:shd w:val="clear" w:color="auto" w:fill="F2F2F2"/>
+            <w:tcMar>
+              <w:top w:w="0" w:type="dxa"/>
+              <w:left w:w="200" w:type="dxa"/>
+              <w:bottom w:w="0" w:type="dxa"/>
+              <w:right w:w="200" w:type="dxa"/>
+            </w:tcMar>
+          </w:tcPr>
+          <w:p>
+            <w:pPr>
+              <w:ind w:left="280"/>
+            </w:pPr>
+            <w:r>
+              <w:rPr>
+                <w:rFonts w:ascii="Courier New" w:eastAsia="Courier New" w:hAnsi="Courier New" w:cs="Courier New"/>
+                <w:color w:val="1A1A2E"/>
+                <w:sz w:val="18"/>
+                <w:szCs w:val="18"/>
+              </w:rPr>
+              <w:t xml:space="preserve">    DaysSince &lt;= 180,  2,</w:t>
+            </w:r>
+          </w:p>
+        </w:tc>
+      </w:tr>
+      <w:tr>
+        <w:tc>
+          <w:tcPr>
+            <w:tcW w:w="9026" w:type="dxa"/>
+            <w:tcBorders>
+              <w:top w:val="none" w:sz="0" w:space="0" w:color="FFFFFF"/>
+              <w:left w:val="none" w:sz="0" w:space="0" w:color="FFFFFF"/>
+              <w:bottom w:val="none" w:sz="0" w:space="0" w:color="FFFFFF"/>
+              <w:right w:val="none" w:sz="0" w:space="0" w:color="FFFFFF"/>
+            </w:tcBorders>
+            <w:shd w:val="clear" w:color="auto" w:fill="F2F2F2"/>
+            <w:tcMar>
+              <w:top w:w="0" w:type="dxa"/>
+              <w:left w:w="200" w:type="dxa"/>
+              <w:bottom w:w="0" w:type="dxa"/>
+              <w:right w:w="200" w:type="dxa"/>
+            </w:tcMar>
+          </w:tcPr>
+          <w:p>
+            <w:pPr>
+              <w:ind w:left="280"/>
+            </w:pPr>
+            <w:r>
+              <w:rPr>
+                <w:rFonts w:ascii="Courier New" w:eastAsia="Courier New" w:hAnsi="Courier New" w:cs="Courier New"/>
+                <w:color w:val="1A1A2E"/>
+                <w:sz w:val="18"/>
+                <w:szCs w:val="18"/>
+              </w:rPr>
+              <w:t xml:space="preserve">    1</w:t>
             </w:r>
           </w:p>
         </w:tc>
@@ -11958,633 +12062,6 @@
                 <w:sz w:val="18"/>
                 <w:szCs w:val="18"/>
               </w:rPr>
-              <w:t>// RFM Segmentation — Recency, Frequency, Monetary</w:t>
-            </w:r>
-          </w:p>
-        </w:tc>
-      </w:tr>
-      <w:tr>
-        <w:tc>
-          <w:tcPr>
-            <w:tcW w:w="9026" w:type="dxa"/>
-            <w:tcBorders>
-              <w:top w:val="none" w:sz="0" w:space="0" w:color="FFFFFF"/>
-              <w:left w:val="none" w:sz="0" w:space="0" w:color="FFFFFF"/>
-              <w:bottom w:val="none" w:sz="0" w:space="0" w:color="FFFFFF"/>
-              <w:right w:val="none" w:sz="0" w:space="0" w:color="FFFFFF"/>
-            </w:tcBorders>
-            <w:shd w:val="clear" w:color="auto" w:fill="F2F2F2"/>
-            <w:tcMar>
-              <w:top w:w="0" w:type="dxa"/>
-              <w:left w:w="200" w:type="dxa"/>
-              <w:bottom w:w="0" w:type="dxa"/>
-              <w:right w:w="200" w:type="dxa"/>
-            </w:tcMar>
-          </w:tcPr>
-          <w:p>
-            <w:pPr>
-              <w:ind w:left="280"/>
-            </w:pPr>
-            <w:r>
-              <w:rPr>
-                <w:rFonts w:ascii="Courier New" w:eastAsia="Courier New" w:hAnsi="Courier New" w:cs="Courier New"/>
-                <w:color w:val="1A1A2E"/>
-                <w:sz w:val="18"/>
-                <w:szCs w:val="18"/>
-              </w:rPr>
-              <w:t>Recency Score =</w:t>
-            </w:r>
-          </w:p>
-        </w:tc>
-      </w:tr>
-      <w:tr>
-        <w:tc>
-          <w:tcPr>
-            <w:tcW w:w="9026" w:type="dxa"/>
-            <w:tcBorders>
-              <w:top w:val="none" w:sz="0" w:space="0" w:color="FFFFFF"/>
-              <w:left w:val="none" w:sz="0" w:space="0" w:color="FFFFFF"/>
-              <w:bottom w:val="none" w:sz="0" w:space="0" w:color="FFFFFF"/>
-              <w:right w:val="none" w:sz="0" w:space="0" w:color="FFFFFF"/>
-            </w:tcBorders>
-            <w:shd w:val="clear" w:color="auto" w:fill="F2F2F2"/>
-            <w:tcMar>
-              <w:top w:w="0" w:type="dxa"/>
-              <w:left w:w="200" w:type="dxa"/>
-              <w:bottom w:w="0" w:type="dxa"/>
-              <w:right w:w="200" w:type="dxa"/>
-            </w:tcMar>
-          </w:tcPr>
-          <w:p>
-            <w:pPr>
-              <w:ind w:left="280"/>
-            </w:pPr>
-            <w:r>
-              <w:rPr>
-                <w:rFonts w:ascii="Courier New" w:eastAsia="Courier New" w:hAnsi="Courier New" w:cs="Courier New"/>
-                <w:color w:val="1A1A2E"/>
-                <w:sz w:val="18"/>
-                <w:szCs w:val="18"/>
-              </w:rPr>
-              <w:t xml:space="preserve">VAR </w:t>
-            </w:r>
-            <w:proofErr w:type="spellStart"/>
-            <w:r>
-              <w:rPr>
-                <w:rFonts w:ascii="Courier New" w:eastAsia="Courier New" w:hAnsi="Courier New" w:cs="Courier New"/>
-                <w:color w:val="1A1A2E"/>
-                <w:sz w:val="18"/>
-                <w:szCs w:val="18"/>
-              </w:rPr>
-              <w:t>LastPurchase</w:t>
-            </w:r>
-            <w:proofErr w:type="spellEnd"/>
-            <w:r>
-              <w:rPr>
-                <w:rFonts w:ascii="Courier New" w:eastAsia="Courier New" w:hAnsi="Courier New" w:cs="Courier New"/>
-                <w:color w:val="1A1A2E"/>
-                <w:sz w:val="18"/>
-                <w:szCs w:val="18"/>
-              </w:rPr>
-              <w:t xml:space="preserve"> = CALCULATE(MAX(Sales[</w:t>
-            </w:r>
-            <w:proofErr w:type="spellStart"/>
-            <w:r>
-              <w:rPr>
-                <w:rFonts w:ascii="Courier New" w:eastAsia="Courier New" w:hAnsi="Courier New" w:cs="Courier New"/>
-                <w:color w:val="1A1A2E"/>
-                <w:sz w:val="18"/>
-                <w:szCs w:val="18"/>
-              </w:rPr>
-              <w:t>OrderDate</w:t>
-            </w:r>
-            <w:proofErr w:type="spellEnd"/>
-            <w:r>
-              <w:rPr>
-                <w:rFonts w:ascii="Courier New" w:eastAsia="Courier New" w:hAnsi="Courier New" w:cs="Courier New"/>
-                <w:color w:val="1A1A2E"/>
-                <w:sz w:val="18"/>
-                <w:szCs w:val="18"/>
-              </w:rPr>
-              <w:t>]), ALLEXCEPT(Customers, Customers[CustomerID]))</w:t>
-            </w:r>
-          </w:p>
-        </w:tc>
-      </w:tr>
-      <w:tr>
-        <w:tc>
-          <w:tcPr>
-            <w:tcW w:w="9026" w:type="dxa"/>
-            <w:tcBorders>
-              <w:top w:val="none" w:sz="0" w:space="0" w:color="FFFFFF"/>
-              <w:left w:val="none" w:sz="0" w:space="0" w:color="FFFFFF"/>
-              <w:bottom w:val="none" w:sz="0" w:space="0" w:color="FFFFFF"/>
-              <w:right w:val="none" w:sz="0" w:space="0" w:color="FFFFFF"/>
-            </w:tcBorders>
-            <w:shd w:val="clear" w:color="auto" w:fill="F2F2F2"/>
-            <w:tcMar>
-              <w:top w:w="0" w:type="dxa"/>
-              <w:left w:w="200" w:type="dxa"/>
-              <w:bottom w:w="0" w:type="dxa"/>
-              <w:right w:w="200" w:type="dxa"/>
-            </w:tcMar>
-          </w:tcPr>
-          <w:p>
-            <w:pPr>
-              <w:ind w:left="280"/>
-            </w:pPr>
-            <w:r>
-              <w:rPr>
-                <w:rFonts w:ascii="Courier New" w:eastAsia="Courier New" w:hAnsi="Courier New" w:cs="Courier New"/>
-                <w:color w:val="1A1A2E"/>
-                <w:sz w:val="18"/>
-                <w:szCs w:val="18"/>
-              </w:rPr>
-              <w:t xml:space="preserve">VAR </w:t>
-            </w:r>
-            <w:proofErr w:type="spellStart"/>
-            <w:r>
-              <w:rPr>
-                <w:rFonts w:ascii="Courier New" w:eastAsia="Courier New" w:hAnsi="Courier New" w:cs="Courier New"/>
-                <w:color w:val="1A1A2E"/>
-                <w:sz w:val="18"/>
-                <w:szCs w:val="18"/>
-              </w:rPr>
-              <w:t>DaysSince</w:t>
-            </w:r>
-            <w:proofErr w:type="spellEnd"/>
-            <w:r>
-              <w:rPr>
-                <w:rFonts w:ascii="Courier New" w:eastAsia="Courier New" w:hAnsi="Courier New" w:cs="Courier New"/>
-                <w:color w:val="1A1A2E"/>
-                <w:sz w:val="18"/>
-                <w:szCs w:val="18"/>
-              </w:rPr>
-              <w:t xml:space="preserve">    = DATEDIFF(</w:t>
-            </w:r>
-            <w:proofErr w:type="spellStart"/>
-            <w:r>
-              <w:rPr>
-                <w:rFonts w:ascii="Courier New" w:eastAsia="Courier New" w:hAnsi="Courier New" w:cs="Courier New"/>
-                <w:color w:val="1A1A2E"/>
-                <w:sz w:val="18"/>
-                <w:szCs w:val="18"/>
-              </w:rPr>
-              <w:t>LastPurchase</w:t>
-            </w:r>
-            <w:proofErr w:type="spellEnd"/>
-            <w:r>
-              <w:rPr>
-                <w:rFonts w:ascii="Courier New" w:eastAsia="Courier New" w:hAnsi="Courier New" w:cs="Courier New"/>
-                <w:color w:val="1A1A2E"/>
-                <w:sz w:val="18"/>
-                <w:szCs w:val="18"/>
-              </w:rPr>
-              <w:t>, TODAY(), DAY)</w:t>
-            </w:r>
-          </w:p>
-        </w:tc>
-      </w:tr>
-      <w:tr>
-        <w:tc>
-          <w:tcPr>
-            <w:tcW w:w="9026" w:type="dxa"/>
-            <w:tcBorders>
-              <w:top w:val="none" w:sz="0" w:space="0" w:color="FFFFFF"/>
-              <w:left w:val="none" w:sz="0" w:space="0" w:color="FFFFFF"/>
-              <w:bottom w:val="none" w:sz="0" w:space="0" w:color="FFFFFF"/>
-              <w:right w:val="none" w:sz="0" w:space="0" w:color="FFFFFF"/>
-            </w:tcBorders>
-            <w:shd w:val="clear" w:color="auto" w:fill="F2F2F2"/>
-            <w:tcMar>
-              <w:top w:w="0" w:type="dxa"/>
-              <w:left w:w="200" w:type="dxa"/>
-              <w:bottom w:w="0" w:type="dxa"/>
-              <w:right w:w="200" w:type="dxa"/>
-            </w:tcMar>
-          </w:tcPr>
-          <w:p>
-            <w:pPr>
-              <w:ind w:left="280"/>
-            </w:pPr>
-            <w:r>
-              <w:rPr>
-                <w:rFonts w:ascii="Courier New" w:eastAsia="Courier New" w:hAnsi="Courier New" w:cs="Courier New"/>
-                <w:color w:val="1A1A2E"/>
-                <w:sz w:val="18"/>
-                <w:szCs w:val="18"/>
-              </w:rPr>
-              <w:t>RETURN</w:t>
-            </w:r>
-          </w:p>
-        </w:tc>
-      </w:tr>
-      <w:tr>
-        <w:tc>
-          <w:tcPr>
-            <w:tcW w:w="9026" w:type="dxa"/>
-            <w:tcBorders>
-              <w:top w:val="none" w:sz="0" w:space="0" w:color="FFFFFF"/>
-              <w:left w:val="none" w:sz="0" w:space="0" w:color="FFFFFF"/>
-              <w:bottom w:val="none" w:sz="0" w:space="0" w:color="FFFFFF"/>
-              <w:right w:val="none" w:sz="0" w:space="0" w:color="FFFFFF"/>
-            </w:tcBorders>
-            <w:shd w:val="clear" w:color="auto" w:fill="F2F2F2"/>
-            <w:tcMar>
-              <w:top w:w="0" w:type="dxa"/>
-              <w:left w:w="200" w:type="dxa"/>
-              <w:bottom w:w="0" w:type="dxa"/>
-              <w:right w:w="200" w:type="dxa"/>
-            </w:tcMar>
-          </w:tcPr>
-          <w:p>
-            <w:pPr>
-              <w:ind w:left="280"/>
-            </w:pPr>
-            <w:r>
-              <w:rPr>
-                <w:rFonts w:ascii="Courier New" w:eastAsia="Courier New" w:hAnsi="Courier New" w:cs="Courier New"/>
-                <w:color w:val="1A1A2E"/>
-                <w:sz w:val="18"/>
-                <w:szCs w:val="18"/>
-              </w:rPr>
-              <w:t>SWITCH(</w:t>
-            </w:r>
-          </w:p>
-        </w:tc>
-      </w:tr>
-      <w:tr>
-        <w:tc>
-          <w:tcPr>
-            <w:tcW w:w="9026" w:type="dxa"/>
-            <w:tcBorders>
-              <w:top w:val="none" w:sz="0" w:space="0" w:color="FFFFFF"/>
-              <w:left w:val="none" w:sz="0" w:space="0" w:color="FFFFFF"/>
-              <w:bottom w:val="none" w:sz="0" w:space="0" w:color="FFFFFF"/>
-              <w:right w:val="none" w:sz="0" w:space="0" w:color="FFFFFF"/>
-            </w:tcBorders>
-            <w:shd w:val="clear" w:color="auto" w:fill="F2F2F2"/>
-            <w:tcMar>
-              <w:top w:w="0" w:type="dxa"/>
-              <w:left w:w="200" w:type="dxa"/>
-              <w:bottom w:w="0" w:type="dxa"/>
-              <w:right w:w="200" w:type="dxa"/>
-            </w:tcMar>
-          </w:tcPr>
-          <w:p>
-            <w:pPr>
-              <w:ind w:left="280"/>
-            </w:pPr>
-            <w:r>
-              <w:rPr>
-                <w:rFonts w:ascii="Courier New" w:eastAsia="Courier New" w:hAnsi="Courier New" w:cs="Courier New"/>
-                <w:color w:val="1A1A2E"/>
-                <w:sz w:val="18"/>
-                <w:szCs w:val="18"/>
-              </w:rPr>
-              <w:t xml:space="preserve">    TRUE(),</w:t>
-            </w:r>
-          </w:p>
-        </w:tc>
-      </w:tr>
-      <w:tr>
-        <w:tc>
-          <w:tcPr>
-            <w:tcW w:w="9026" w:type="dxa"/>
-            <w:tcBorders>
-              <w:top w:val="none" w:sz="0" w:space="0" w:color="FFFFFF"/>
-              <w:left w:val="none" w:sz="0" w:space="0" w:color="FFFFFF"/>
-              <w:bottom w:val="none" w:sz="0" w:space="0" w:color="FFFFFF"/>
-              <w:right w:val="none" w:sz="0" w:space="0" w:color="FFFFFF"/>
-            </w:tcBorders>
-            <w:shd w:val="clear" w:color="auto" w:fill="F2F2F2"/>
-            <w:tcMar>
-              <w:top w:w="0" w:type="dxa"/>
-              <w:left w:w="200" w:type="dxa"/>
-              <w:bottom w:w="0" w:type="dxa"/>
-              <w:right w:w="200" w:type="dxa"/>
-            </w:tcMar>
-          </w:tcPr>
-          <w:p>
-            <w:pPr>
-              <w:ind w:left="280"/>
-            </w:pPr>
-            <w:r>
-              <w:rPr>
-                <w:rFonts w:ascii="Courier New" w:eastAsia="Courier New" w:hAnsi="Courier New" w:cs="Courier New"/>
-                <w:color w:val="1A1A2E"/>
-                <w:sz w:val="18"/>
-                <w:szCs w:val="18"/>
-              </w:rPr>
-              <w:t xml:space="preserve">    </w:t>
-            </w:r>
-            <w:proofErr w:type="spellStart"/>
-            <w:r>
-              <w:rPr>
-                <w:rFonts w:ascii="Courier New" w:eastAsia="Courier New" w:hAnsi="Courier New" w:cs="Courier New"/>
-                <w:color w:val="1A1A2E"/>
-                <w:sz w:val="18"/>
-                <w:szCs w:val="18"/>
-              </w:rPr>
-              <w:t>DaysSince</w:t>
-            </w:r>
-            <w:proofErr w:type="spellEnd"/>
-            <w:r>
-              <w:rPr>
-                <w:rFonts w:ascii="Courier New" w:eastAsia="Courier New" w:hAnsi="Courier New" w:cs="Courier New"/>
-                <w:color w:val="1A1A2E"/>
-                <w:sz w:val="18"/>
-                <w:szCs w:val="18"/>
-              </w:rPr>
-              <w:t xml:space="preserve"> &lt;= 30,   5,</w:t>
-            </w:r>
-          </w:p>
-        </w:tc>
-      </w:tr>
-      <w:tr>
-        <w:tc>
-          <w:tcPr>
-            <w:tcW w:w="9026" w:type="dxa"/>
-            <w:tcBorders>
-              <w:top w:val="none" w:sz="0" w:space="0" w:color="FFFFFF"/>
-              <w:left w:val="none" w:sz="0" w:space="0" w:color="FFFFFF"/>
-              <w:bottom w:val="none" w:sz="0" w:space="0" w:color="FFFFFF"/>
-              <w:right w:val="none" w:sz="0" w:space="0" w:color="FFFFFF"/>
-            </w:tcBorders>
-            <w:shd w:val="clear" w:color="auto" w:fill="F2F2F2"/>
-            <w:tcMar>
-              <w:top w:w="0" w:type="dxa"/>
-              <w:left w:w="200" w:type="dxa"/>
-              <w:bottom w:w="0" w:type="dxa"/>
-              <w:right w:w="200" w:type="dxa"/>
-            </w:tcMar>
-          </w:tcPr>
-          <w:p>
-            <w:pPr>
-              <w:ind w:left="280"/>
-            </w:pPr>
-            <w:r>
-              <w:rPr>
-                <w:rFonts w:ascii="Courier New" w:eastAsia="Courier New" w:hAnsi="Courier New" w:cs="Courier New"/>
-                <w:color w:val="1A1A2E"/>
-                <w:sz w:val="18"/>
-                <w:szCs w:val="18"/>
-              </w:rPr>
-              <w:t xml:space="preserve">    </w:t>
-            </w:r>
-            <w:proofErr w:type="spellStart"/>
-            <w:r>
-              <w:rPr>
-                <w:rFonts w:ascii="Courier New" w:eastAsia="Courier New" w:hAnsi="Courier New" w:cs="Courier New"/>
-                <w:color w:val="1A1A2E"/>
-                <w:sz w:val="18"/>
-                <w:szCs w:val="18"/>
-              </w:rPr>
-              <w:t>DaysSince</w:t>
-            </w:r>
-            <w:proofErr w:type="spellEnd"/>
-            <w:r>
-              <w:rPr>
-                <w:rFonts w:ascii="Courier New" w:eastAsia="Courier New" w:hAnsi="Courier New" w:cs="Courier New"/>
-                <w:color w:val="1A1A2E"/>
-                <w:sz w:val="18"/>
-                <w:szCs w:val="18"/>
-              </w:rPr>
-              <w:t xml:space="preserve"> &lt;= 60,   4,</w:t>
-            </w:r>
-          </w:p>
-        </w:tc>
-      </w:tr>
-      <w:tr>
-        <w:tc>
-          <w:tcPr>
-            <w:tcW w:w="9026" w:type="dxa"/>
-            <w:tcBorders>
-              <w:top w:val="none" w:sz="0" w:space="0" w:color="FFFFFF"/>
-              <w:left w:val="none" w:sz="0" w:space="0" w:color="FFFFFF"/>
-              <w:bottom w:val="none" w:sz="0" w:space="0" w:color="FFFFFF"/>
-              <w:right w:val="none" w:sz="0" w:space="0" w:color="FFFFFF"/>
-            </w:tcBorders>
-            <w:shd w:val="clear" w:color="auto" w:fill="F2F2F2"/>
-            <w:tcMar>
-              <w:top w:w="0" w:type="dxa"/>
-              <w:left w:w="200" w:type="dxa"/>
-              <w:bottom w:w="0" w:type="dxa"/>
-              <w:right w:w="200" w:type="dxa"/>
-            </w:tcMar>
-          </w:tcPr>
-          <w:p>
-            <w:pPr>
-              <w:ind w:left="280"/>
-            </w:pPr>
-            <w:r>
-              <w:rPr>
-                <w:rFonts w:ascii="Courier New" w:eastAsia="Courier New" w:hAnsi="Courier New" w:cs="Courier New"/>
-                <w:color w:val="1A1A2E"/>
-                <w:sz w:val="18"/>
-                <w:szCs w:val="18"/>
-              </w:rPr>
-              <w:t xml:space="preserve">    </w:t>
-            </w:r>
-            <w:proofErr w:type="spellStart"/>
-            <w:r>
-              <w:rPr>
-                <w:rFonts w:ascii="Courier New" w:eastAsia="Courier New" w:hAnsi="Courier New" w:cs="Courier New"/>
-                <w:color w:val="1A1A2E"/>
-                <w:sz w:val="18"/>
-                <w:szCs w:val="18"/>
-              </w:rPr>
-              <w:t>DaysSince</w:t>
-            </w:r>
-            <w:proofErr w:type="spellEnd"/>
-            <w:r>
-              <w:rPr>
-                <w:rFonts w:ascii="Courier New" w:eastAsia="Courier New" w:hAnsi="Courier New" w:cs="Courier New"/>
-                <w:color w:val="1A1A2E"/>
-                <w:sz w:val="18"/>
-                <w:szCs w:val="18"/>
-              </w:rPr>
-              <w:t xml:space="preserve"> &lt;= 90,   3,</w:t>
-            </w:r>
-          </w:p>
-        </w:tc>
-      </w:tr>
-      <w:tr>
-        <w:tc>
-          <w:tcPr>
-            <w:tcW w:w="9026" w:type="dxa"/>
-            <w:tcBorders>
-              <w:top w:val="none" w:sz="0" w:space="0" w:color="FFFFFF"/>
-              <w:left w:val="none" w:sz="0" w:space="0" w:color="FFFFFF"/>
-              <w:bottom w:val="none" w:sz="0" w:space="0" w:color="FFFFFF"/>
-              <w:right w:val="none" w:sz="0" w:space="0" w:color="FFFFFF"/>
-            </w:tcBorders>
-            <w:shd w:val="clear" w:color="auto" w:fill="F2F2F2"/>
-            <w:tcMar>
-              <w:top w:w="0" w:type="dxa"/>
-              <w:left w:w="200" w:type="dxa"/>
-              <w:bottom w:w="0" w:type="dxa"/>
-              <w:right w:w="200" w:type="dxa"/>
-            </w:tcMar>
-          </w:tcPr>
-          <w:p>
-            <w:pPr>
-              <w:ind w:left="280"/>
-            </w:pPr>
-            <w:r>
-              <w:rPr>
-                <w:rFonts w:ascii="Courier New" w:eastAsia="Courier New" w:hAnsi="Courier New" w:cs="Courier New"/>
-                <w:color w:val="1A1A2E"/>
-                <w:sz w:val="18"/>
-                <w:szCs w:val="18"/>
-              </w:rPr>
-              <w:t xml:space="preserve">    </w:t>
-            </w:r>
-            <w:proofErr w:type="spellStart"/>
-            <w:r>
-              <w:rPr>
-                <w:rFonts w:ascii="Courier New" w:eastAsia="Courier New" w:hAnsi="Courier New" w:cs="Courier New"/>
-                <w:color w:val="1A1A2E"/>
-                <w:sz w:val="18"/>
-                <w:szCs w:val="18"/>
-              </w:rPr>
-              <w:t>DaysSince</w:t>
-            </w:r>
-            <w:proofErr w:type="spellEnd"/>
-            <w:r>
-              <w:rPr>
-                <w:rFonts w:ascii="Courier New" w:eastAsia="Courier New" w:hAnsi="Courier New" w:cs="Courier New"/>
-                <w:color w:val="1A1A2E"/>
-                <w:sz w:val="18"/>
-                <w:szCs w:val="18"/>
-              </w:rPr>
-              <w:t xml:space="preserve"> &lt;= 180,  2,</w:t>
-            </w:r>
-          </w:p>
-        </w:tc>
-      </w:tr>
-      <w:tr>
-        <w:tc>
-          <w:tcPr>
-            <w:tcW w:w="9026" w:type="dxa"/>
-            <w:tcBorders>
-              <w:top w:val="none" w:sz="0" w:space="0" w:color="FFFFFF"/>
-              <w:left w:val="none" w:sz="0" w:space="0" w:color="FFFFFF"/>
-              <w:bottom w:val="none" w:sz="0" w:space="0" w:color="FFFFFF"/>
-              <w:right w:val="none" w:sz="0" w:space="0" w:color="FFFFFF"/>
-            </w:tcBorders>
-            <w:shd w:val="clear" w:color="auto" w:fill="F2F2F2"/>
-            <w:tcMar>
-              <w:top w:w="0" w:type="dxa"/>
-              <w:left w:w="200" w:type="dxa"/>
-              <w:bottom w:w="0" w:type="dxa"/>
-              <w:right w:w="200" w:type="dxa"/>
-            </w:tcMar>
-          </w:tcPr>
-          <w:p>
-            <w:pPr>
-              <w:ind w:left="280"/>
-            </w:pPr>
-            <w:r>
-              <w:rPr>
-                <w:rFonts w:ascii="Courier New" w:eastAsia="Courier New" w:hAnsi="Courier New" w:cs="Courier New"/>
-                <w:color w:val="1A1A2E"/>
-                <w:sz w:val="18"/>
-                <w:szCs w:val="18"/>
-              </w:rPr>
-              <w:t xml:space="preserve">    1</w:t>
-            </w:r>
-          </w:p>
-        </w:tc>
-      </w:tr>
-      <w:tr>
-        <w:tc>
-          <w:tcPr>
-            <w:tcW w:w="9026" w:type="dxa"/>
-            <w:tcBorders>
-              <w:top w:val="none" w:sz="0" w:space="0" w:color="FFFFFF"/>
-              <w:left w:val="none" w:sz="0" w:space="0" w:color="FFFFFF"/>
-              <w:bottom w:val="none" w:sz="0" w:space="0" w:color="FFFFFF"/>
-              <w:right w:val="none" w:sz="0" w:space="0" w:color="FFFFFF"/>
-            </w:tcBorders>
-            <w:shd w:val="clear" w:color="auto" w:fill="F2F2F2"/>
-            <w:tcMar>
-              <w:top w:w="0" w:type="dxa"/>
-              <w:left w:w="200" w:type="dxa"/>
-              <w:bottom w:w="0" w:type="dxa"/>
-              <w:right w:w="200" w:type="dxa"/>
-            </w:tcMar>
-          </w:tcPr>
-          <w:p>
-            <w:pPr>
-              <w:ind w:left="280"/>
-            </w:pPr>
-            <w:r>
-              <w:rPr>
-                <w:rFonts w:ascii="Courier New" w:eastAsia="Courier New" w:hAnsi="Courier New" w:cs="Courier New"/>
-                <w:color w:val="1A1A2E"/>
-                <w:sz w:val="18"/>
-                <w:szCs w:val="18"/>
-              </w:rPr>
-              <w:t>)</w:t>
-            </w:r>
-          </w:p>
-        </w:tc>
-      </w:tr>
-      <w:tr>
-        <w:tc>
-          <w:tcPr>
-            <w:tcW w:w="9026" w:type="dxa"/>
-            <w:tcBorders>
-              <w:top w:val="none" w:sz="0" w:space="0" w:color="FFFFFF"/>
-              <w:left w:val="none" w:sz="0" w:space="0" w:color="FFFFFF"/>
-              <w:bottom w:val="none" w:sz="0" w:space="0" w:color="FFFFFF"/>
-              <w:right w:val="none" w:sz="0" w:space="0" w:color="FFFFFF"/>
-            </w:tcBorders>
-            <w:shd w:val="clear" w:color="auto" w:fill="F2F2F2"/>
-            <w:tcMar>
-              <w:top w:w="0" w:type="dxa"/>
-              <w:left w:w="200" w:type="dxa"/>
-              <w:bottom w:w="0" w:type="dxa"/>
-              <w:right w:w="200" w:type="dxa"/>
-            </w:tcMar>
-          </w:tcPr>
-          <w:p>
-            <w:pPr>
-              <w:ind w:left="280"/>
-            </w:pPr>
-          </w:p>
-        </w:tc>
-      </w:tr>
-      <w:tr>
-        <w:tc>
-          <w:tcPr>
-            <w:tcW w:w="9026" w:type="dxa"/>
-            <w:tcBorders>
-              <w:top w:val="none" w:sz="0" w:space="0" w:color="FFFFFF"/>
-              <w:left w:val="none" w:sz="0" w:space="0" w:color="FFFFFF"/>
-              <w:bottom w:val="none" w:sz="0" w:space="0" w:color="FFFFFF"/>
-              <w:right w:val="none" w:sz="0" w:space="0" w:color="FFFFFF"/>
-            </w:tcBorders>
-            <w:shd w:val="clear" w:color="auto" w:fill="F2F2F2"/>
-            <w:tcMar>
-              <w:top w:w="0" w:type="dxa"/>
-              <w:left w:w="200" w:type="dxa"/>
-              <w:bottom w:w="0" w:type="dxa"/>
-              <w:right w:w="200" w:type="dxa"/>
-            </w:tcMar>
-          </w:tcPr>
-          <w:p>
-            <w:pPr>
-              <w:ind w:left="280"/>
-            </w:pPr>
-            <w:r>
-              <w:rPr>
-                <w:rFonts w:ascii="Courier New" w:eastAsia="Courier New" w:hAnsi="Courier New" w:cs="Courier New"/>
-                <w:color w:val="1A1A2E"/>
-                <w:sz w:val="18"/>
-                <w:szCs w:val="18"/>
-              </w:rPr>
               <w:t>// Dynamic Top N using TOPN + RANKX</w:t>
             </w:r>
           </w:p>
@@ -12654,27 +12131,7 @@
                 <w:szCs w:val="18"/>
               </w:rPr>
               <w:lastRenderedPageBreak/>
-              <w:t>VAR N = SELECTEDVALUE(</w:t>
-            </w:r>
-            <w:proofErr w:type="spellStart"/>
-            <w:r>
-              <w:rPr>
-                <w:rFonts w:ascii="Courier New" w:eastAsia="Courier New" w:hAnsi="Courier New" w:cs="Courier New"/>
-                <w:color w:val="1A1A2E"/>
-                <w:sz w:val="18"/>
-                <w:szCs w:val="18"/>
-              </w:rPr>
-              <w:t>TopNParam</w:t>
-            </w:r>
-            <w:proofErr w:type="spellEnd"/>
-            <w:r>
-              <w:rPr>
-                <w:rFonts w:ascii="Courier New" w:eastAsia="Courier New" w:hAnsi="Courier New" w:cs="Courier New"/>
-                <w:color w:val="1A1A2E"/>
-                <w:sz w:val="18"/>
-                <w:szCs w:val="18"/>
-              </w:rPr>
-              <w:t>[Value], 10)</w:t>
+              <w:t>VAR N = SELECTEDVALUE(TopNParam[Value], 10)</w:t>
             </w:r>
           </w:p>
         </w:tc>

</xml_diff>